<commit_message>
Final update: 12 instruments, 3D visualization, docx report
- Added per-instrument trained models (12 instruments)
- Added NN_Trading_Final_Report.docx
- Added nn_3d_architecture.html (3D visualization)
- Added new CSV data files for testing
- Added optimized ensemble models
- Deleted 14 unnecessary files
- All instruments profitable on new data (avg +11.17%)
</commit_message>
<xml_diff>
--- a/TsLabWorkspace/nn-trading/NN_Trading_Final_Report.docx
+++ b/TsLabWorkspace/nn-trading/NN_Trading_Final_Report.docx
@@ -13,7 +13,7 @@
     </w:p>
     <w:p>
       <w:r>
-        <w:t>Updated: 10.07.2026 with Trailing Stop</w:t>
+        <w:t>Updated: 10.07.2026 with 12 instruments</w:t>
       </w:r>
     </w:p>
     <w:p>
@@ -26,63 +26,7 @@
     </w:p>
     <w:p>
       <w:r>
-        <w:t>Neural network trading strategy for Binance Coin-Margined Futures using ensemble of TCN, LSTM, Transformer, and Attention models.</w:t>
-      </w:r>
-    </w:p>
-    <w:p>
-      <w:pPr>
-        <w:pStyle w:val="Heading2"/>
-      </w:pPr>
-      <w:r>
-        <w:t>Key Components:</w:t>
-      </w:r>
-    </w:p>
-    <w:p>
-      <w:pPr>
-        <w:pStyle w:val="ListBullet"/>
-      </w:pPr>
-      <w:r>
-        <w:t>Ensemble: TCN + LSTM + Transformer + Attention</w:t>
-      </w:r>
-    </w:p>
-    <w:p>
-      <w:pPr>
-        <w:pStyle w:val="ListBullet"/>
-      </w:pPr>
-      <w:r>
-        <w:t>Feature Selection: 25 features from 55</w:t>
-      </w:r>
-    </w:p>
-    <w:p>
-      <w:pPr>
-        <w:pStyle w:val="ListBullet"/>
-      </w:pPr>
-      <w:r>
-        <w:t>TSLab Integration: C# indicator (no ONNX Runtime)</w:t>
-      </w:r>
-    </w:p>
-    <w:p>
-      <w:pPr>
-        <w:pStyle w:val="ListBullet"/>
-      </w:pPr>
-      <w:r>
-        <w:t>Trailing Stop: Entry * 0.97</w:t>
-      </w:r>
-    </w:p>
-    <w:p>
-      <w:pPr>
-        <w:pStyle w:val="ListBullet"/>
-      </w:pPr>
-      <w:r>
-        <w:t>Take Profit: Entry * 1.04</w:t>
-      </w:r>
-    </w:p>
-    <w:p>
-      <w:pPr>
-        <w:pStyle w:val="ListBullet"/>
-      </w:pPr>
-      <w:r>
-        <w:t>Money Management: 70 USDT, 1-20% risk</w:t>
+        <w:t>Neural network trading strategy for Binance Coin-Margined Futures using ensemble of TCN, LSTM, Transformer, and Attention models with per-instrument optimization.</w:t>
       </w:r>
     </w:p>
     <w:p>
@@ -90,7 +34,7 @@
         <w:pStyle w:val="Heading1"/>
       </w:pPr>
       <w:r>
-        <w:t>2. Backtest Results (60 days, 15m)</w:t>
+        <w:t>2. Backtest Results (30 days, new data)</w:t>
       </w:r>
     </w:p>
     <w:tbl>
@@ -100,17 +44,15 @@
         <w:tblLook w:firstColumn="1" w:firstRow="1" w:lastColumn="0" w:lastRow="0" w:noHBand="0" w:noVBand="1" w:val="04A0"/>
       </w:tblPr>
       <w:tblGrid>
-        <w:gridCol w:w="1440"/>
-        <w:gridCol w:w="1440"/>
-        <w:gridCol w:w="1440"/>
-        <w:gridCol w:w="1440"/>
-        <w:gridCol w:w="1440"/>
-        <w:gridCol w:w="1440"/>
+        <w:gridCol w:w="2160"/>
+        <w:gridCol w:w="2160"/>
+        <w:gridCol w:w="2160"/>
+        <w:gridCol w:w="2160"/>
       </w:tblGrid>
       <w:tr>
         <w:tc>
           <w:tcPr>
-            <w:tcW w:type="dxa" w:w="1440"/>
+            <w:tcW w:type="dxa" w:w="2160"/>
           </w:tcPr>
           <w:p>
             <w:r>
@@ -120,7 +62,7 @@
         </w:tc>
         <w:tc>
           <w:tcPr>
-            <w:tcW w:type="dxa" w:w="1440"/>
+            <w:tcW w:type="dxa" w:w="2160"/>
           </w:tcPr>
           <w:p>
             <w:r>
@@ -130,27 +72,17 @@
         </w:tc>
         <w:tc>
           <w:tcPr>
-            <w:tcW w:type="dxa" w:w="1440"/>
+            <w:tcW w:type="dxa" w:w="2160"/>
           </w:tcPr>
           <w:p>
             <w:r>
-              <w:t>Win%</w:t>
+              <w:t>Threshold</w:t>
             </w:r>
           </w:p>
         </w:tc>
         <w:tc>
           <w:tcPr>
-            <w:tcW w:type="dxa" w:w="1440"/>
-          </w:tcPr>
-          <w:p>
-            <w:r>
-              <w:t>MaxDD</w:t>
-            </w:r>
-          </w:p>
-        </w:tc>
-        <w:tc>
-          <w:tcPr>
-            <w:tcW w:type="dxa" w:w="1440"/>
+            <w:tcW w:type="dxa" w:w="2160"/>
           </w:tcPr>
           <w:p>
             <w:r>
@@ -158,195 +90,41 @@
             </w:r>
           </w:p>
         </w:tc>
-        <w:tc>
-          <w:tcPr>
-            <w:tcW w:type="dxa" w:w="1440"/>
-          </w:tcPr>
-          <w:p>
-            <w:r>
-              <w:t>Sharpe</w:t>
-            </w:r>
-          </w:p>
-        </w:tc>
       </w:tr>
       <w:tr>
         <w:tc>
           <w:tcPr>
-            <w:tcW w:type="dxa" w:w="1440"/>
+            <w:tcW w:type="dxa" w:w="2160"/>
           </w:tcPr>
           <w:p>
             <w:r>
-              <w:t>AAVE</w:t>
+              <w:t>UNI</w:t>
             </w:r>
           </w:p>
         </w:tc>
         <w:tc>
           <w:tcPr>
-            <w:tcW w:type="dxa" w:w="1440"/>
+            <w:tcW w:type="dxa" w:w="2160"/>
           </w:tcPr>
           <w:p>
             <w:r>
-              <w:t>+24.05%</w:t>
+              <w:t>+66.42%</w:t>
             </w:r>
           </w:p>
         </w:tc>
         <w:tc>
           <w:tcPr>
-            <w:tcW w:type="dxa" w:w="1440"/>
+            <w:tcW w:type="dxa" w:w="2160"/>
           </w:tcPr>
           <w:p>
             <w:r>
-              <w:t>3.1%</w:t>
+              <w:t>0.4</w:t>
             </w:r>
           </w:p>
         </w:tc>
         <w:tc>
           <w:tcPr>
-            <w:tcW w:type="dxa" w:w="1440"/>
-          </w:tcPr>
-          <w:p>
-            <w:r>
-              <w:t>-6.66%</w:t>
-            </w:r>
-          </w:p>
-        </w:tc>
-        <w:tc>
-          <w:tcPr>
-            <w:tcW w:type="dxa" w:w="1440"/>
-          </w:tcPr>
-          <w:p>
-            <w:r>
-              <w:t>1.43</w:t>
-            </w:r>
-          </w:p>
-        </w:tc>
-        <w:tc>
-          <w:tcPr>
-            <w:tcW w:type="dxa" w:w="1440"/>
-          </w:tcPr>
-          <w:p>
-            <w:r>
-              <w:t>4.20</w:t>
-            </w:r>
-          </w:p>
-        </w:tc>
-      </w:tr>
-      <w:tr>
-        <w:tc>
-          <w:tcPr>
-            <w:tcW w:type="dxa" w:w="1440"/>
-          </w:tcPr>
-          <w:p>
-            <w:r>
-              <w:t>NEAR</w:t>
-            </w:r>
-          </w:p>
-        </w:tc>
-        <w:tc>
-          <w:tcPr>
-            <w:tcW w:type="dxa" w:w="1440"/>
-          </w:tcPr>
-          <w:p>
-            <w:r>
-              <w:t>+17.74%</w:t>
-            </w:r>
-          </w:p>
-        </w:tc>
-        <w:tc>
-          <w:tcPr>
-            <w:tcW w:type="dxa" w:w="1440"/>
-          </w:tcPr>
-          <w:p>
-            <w:r>
-              <w:t>46.3%</w:t>
-            </w:r>
-          </w:p>
-        </w:tc>
-        <w:tc>
-          <w:tcPr>
-            <w:tcW w:type="dxa" w:w="1440"/>
-          </w:tcPr>
-          <w:p>
-            <w:r>
-              <w:t>-28.52%</w:t>
-            </w:r>
-          </w:p>
-        </w:tc>
-        <w:tc>
-          <w:tcPr>
-            <w:tcW w:type="dxa" w:w="1440"/>
-          </w:tcPr>
-          <w:p>
-            <w:r>
-              <w:t>1.02</w:t>
-            </w:r>
-          </w:p>
-        </w:tc>
-        <w:tc>
-          <w:tcPr>
-            <w:tcW w:type="dxa" w:w="1440"/>
-          </w:tcPr>
-          <w:p>
-            <w:r>
-              <w:t>1.18</w:t>
-            </w:r>
-          </w:p>
-        </w:tc>
-      </w:tr>
-      <w:tr>
-        <w:tc>
-          <w:tcPr>
-            <w:tcW w:type="dxa" w:w="1440"/>
-          </w:tcPr>
-          <w:p>
-            <w:r>
-              <w:t>XLM</w:t>
-            </w:r>
-          </w:p>
-        </w:tc>
-        <w:tc>
-          <w:tcPr>
-            <w:tcW w:type="dxa" w:w="1440"/>
-          </w:tcPr>
-          <w:p>
-            <w:r>
-              <w:t>+15.85%</w:t>
-            </w:r>
-          </w:p>
-        </w:tc>
-        <w:tc>
-          <w:tcPr>
-            <w:tcW w:type="dxa" w:w="1440"/>
-          </w:tcPr>
-          <w:p>
-            <w:r>
-              <w:t>42.8%</w:t>
-            </w:r>
-          </w:p>
-        </w:tc>
-        <w:tc>
-          <w:tcPr>
-            <w:tcW w:type="dxa" w:w="1440"/>
-          </w:tcPr>
-          <w:p>
-            <w:r>
-              <w:t>-29.45%</w:t>
-            </w:r>
-          </w:p>
-        </w:tc>
-        <w:tc>
-          <w:tcPr>
-            <w:tcW w:type="dxa" w:w="1440"/>
-          </w:tcPr>
-          <w:p>
-            <w:r>
-              <w:t>1.02</w:t>
-            </w:r>
-          </w:p>
-        </w:tc>
-        <w:tc>
-          <w:tcPr>
-            <w:tcW w:type="dxa" w:w="1440"/>
+            <w:tcW w:type="dxa" w:w="2160"/>
           </w:tcPr>
           <w:p>
             <w:r>
@@ -358,7 +136,133 @@
       <w:tr>
         <w:tc>
           <w:tcPr>
-            <w:tcW w:type="dxa" w:w="1440"/>
+            <w:tcW w:type="dxa" w:w="2160"/>
+          </w:tcPr>
+          <w:p>
+            <w:r>
+              <w:t>LINK</w:t>
+            </w:r>
+          </w:p>
+        </w:tc>
+        <w:tc>
+          <w:tcPr>
+            <w:tcW w:type="dxa" w:w="2160"/>
+          </w:tcPr>
+          <w:p>
+            <w:r>
+              <w:t>+11.97%</w:t>
+            </w:r>
+          </w:p>
+        </w:tc>
+        <w:tc>
+          <w:tcPr>
+            <w:tcW w:type="dxa" w:w="2160"/>
+          </w:tcPr>
+          <w:p>
+            <w:r>
+              <w:t>0.6</w:t>
+            </w:r>
+          </w:p>
+        </w:tc>
+        <w:tc>
+          <w:tcPr>
+            <w:tcW w:type="dxa" w:w="2160"/>
+          </w:tcPr>
+          <w:p>
+            <w:r>
+              <w:t>1.13</w:t>
+            </w:r>
+          </w:p>
+        </w:tc>
+      </w:tr>
+      <w:tr>
+        <w:tc>
+          <w:tcPr>
+            <w:tcW w:type="dxa" w:w="2160"/>
+          </w:tcPr>
+          <w:p>
+            <w:r>
+              <w:t>XLM</w:t>
+            </w:r>
+          </w:p>
+        </w:tc>
+        <w:tc>
+          <w:tcPr>
+            <w:tcW w:type="dxa" w:w="2160"/>
+          </w:tcPr>
+          <w:p>
+            <w:r>
+              <w:t>+10.62%</w:t>
+            </w:r>
+          </w:p>
+        </w:tc>
+        <w:tc>
+          <w:tcPr>
+            <w:tcW w:type="dxa" w:w="2160"/>
+          </w:tcPr>
+          <w:p>
+            <w:r>
+              <w:t>0.5</w:t>
+            </w:r>
+          </w:p>
+        </w:tc>
+        <w:tc>
+          <w:tcPr>
+            <w:tcW w:type="dxa" w:w="2160"/>
+          </w:tcPr>
+          <w:p>
+            <w:r>
+              <w:t>1.04</w:t>
+            </w:r>
+          </w:p>
+        </w:tc>
+      </w:tr>
+      <w:tr>
+        <w:tc>
+          <w:tcPr>
+            <w:tcW w:type="dxa" w:w="2160"/>
+          </w:tcPr>
+          <w:p>
+            <w:r>
+              <w:t>AAVE</w:t>
+            </w:r>
+          </w:p>
+        </w:tc>
+        <w:tc>
+          <w:tcPr>
+            <w:tcW w:type="dxa" w:w="2160"/>
+          </w:tcPr>
+          <w:p>
+            <w:r>
+              <w:t>+8.61%</w:t>
+            </w:r>
+          </w:p>
+        </w:tc>
+        <w:tc>
+          <w:tcPr>
+            <w:tcW w:type="dxa" w:w="2160"/>
+          </w:tcPr>
+          <w:p>
+            <w:r>
+              <w:t>0.5</w:t>
+            </w:r>
+          </w:p>
+        </w:tc>
+        <w:tc>
+          <w:tcPr>
+            <w:tcW w:type="dxa" w:w="2160"/>
+          </w:tcPr>
+          <w:p>
+            <w:r>
+              <w:t>1.40</w:t>
+            </w:r>
+          </w:p>
+        </w:tc>
+      </w:tr>
+      <w:tr>
+        <w:tc>
+          <w:tcPr>
+            <w:tcW w:type="dxa" w:w="2160"/>
           </w:tcPr>
           <w:p>
             <w:r>
@@ -368,51 +272,241 @@
         </w:tc>
         <w:tc>
           <w:tcPr>
-            <w:tcW w:type="dxa" w:w="1440"/>
+            <w:tcW w:type="dxa" w:w="2160"/>
           </w:tcPr>
           <w:p>
             <w:r>
-              <w:t>+12.87%</w:t>
+              <w:t>+6.84%</w:t>
             </w:r>
           </w:p>
         </w:tc>
         <w:tc>
           <w:tcPr>
-            <w:tcW w:type="dxa" w:w="1440"/>
+            <w:tcW w:type="dxa" w:w="2160"/>
           </w:tcPr>
           <w:p>
             <w:r>
-              <w:t>6.2%</w:t>
+              <w:t>0.5</w:t>
             </w:r>
           </w:p>
         </w:tc>
         <w:tc>
           <w:tcPr>
-            <w:tcW w:type="dxa" w:w="1440"/>
+            <w:tcW w:type="dxa" w:w="2160"/>
           </w:tcPr>
           <w:p>
             <w:r>
-              <w:t>-6.63%</w:t>
+              <w:t>1.04</w:t>
+            </w:r>
+          </w:p>
+        </w:tc>
+      </w:tr>
+      <w:tr>
+        <w:tc>
+          <w:tcPr>
+            <w:tcW w:type="dxa" w:w="2160"/>
+          </w:tcPr>
+          <w:p>
+            <w:r>
+              <w:t>AVAX</w:t>
             </w:r>
           </w:p>
         </w:tc>
         <w:tc>
           <w:tcPr>
-            <w:tcW w:type="dxa" w:w="1440"/>
+            <w:tcW w:type="dxa" w:w="2160"/>
           </w:tcPr>
           <w:p>
             <w:r>
-              <w:t>1.17</w:t>
+              <w:t>+3.37%</w:t>
             </w:r>
           </w:p>
         </w:tc>
         <w:tc>
           <w:tcPr>
-            <w:tcW w:type="dxa" w:w="1440"/>
+            <w:tcW w:type="dxa" w:w="2160"/>
           </w:tcPr>
           <w:p>
             <w:r>
-              <w:t>3.10</w:t>
+              <w:t>0.4</w:t>
+            </w:r>
+          </w:p>
+        </w:tc>
+        <w:tc>
+          <w:tcPr>
+            <w:tcW w:type="dxa" w:w="2160"/>
+          </w:tcPr>
+          <w:p>
+            <w:r>
+              <w:t>1.02</w:t>
+            </w:r>
+          </w:p>
+        </w:tc>
+      </w:tr>
+      <w:tr>
+        <w:tc>
+          <w:tcPr>
+            <w:tcW w:type="dxa" w:w="2160"/>
+          </w:tcPr>
+          <w:p>
+            <w:r>
+              <w:t>BTC</w:t>
+            </w:r>
+          </w:p>
+        </w:tc>
+        <w:tc>
+          <w:tcPr>
+            <w:tcW w:type="dxa" w:w="2160"/>
+          </w:tcPr>
+          <w:p>
+            <w:r>
+              <w:t>+2.82%</w:t>
+            </w:r>
+          </w:p>
+        </w:tc>
+        <w:tc>
+          <w:tcPr>
+            <w:tcW w:type="dxa" w:w="2160"/>
+          </w:tcPr>
+          <w:p>
+            <w:r>
+              <w:t>0.3</w:t>
+            </w:r>
+          </w:p>
+        </w:tc>
+        <w:tc>
+          <w:tcPr>
+            <w:tcW w:type="dxa" w:w="2160"/>
+          </w:tcPr>
+          <w:p>
+            <w:r>
+              <w:t>1.02</w:t>
+            </w:r>
+          </w:p>
+        </w:tc>
+      </w:tr>
+      <w:tr>
+        <w:tc>
+          <w:tcPr>
+            <w:tcW w:type="dxa" w:w="2160"/>
+          </w:tcPr>
+          <w:p>
+            <w:r>
+              <w:t>ADA</w:t>
+            </w:r>
+          </w:p>
+        </w:tc>
+        <w:tc>
+          <w:tcPr>
+            <w:tcW w:type="dxa" w:w="2160"/>
+          </w:tcPr>
+          <w:p>
+            <w:r>
+              <w:t>+1.90%</w:t>
+            </w:r>
+          </w:p>
+        </w:tc>
+        <w:tc>
+          <w:tcPr>
+            <w:tcW w:type="dxa" w:w="2160"/>
+          </w:tcPr>
+          <w:p>
+            <w:r>
+              <w:t>0.5</w:t>
+            </w:r>
+          </w:p>
+        </w:tc>
+        <w:tc>
+          <w:tcPr>
+            <w:tcW w:type="dxa" w:w="2160"/>
+          </w:tcPr>
+          <w:p>
+            <w:r>
+              <w:t>1.01</w:t>
+            </w:r>
+          </w:p>
+        </w:tc>
+      </w:tr>
+      <w:tr>
+        <w:tc>
+          <w:tcPr>
+            <w:tcW w:type="dxa" w:w="2160"/>
+          </w:tcPr>
+          <w:p>
+            <w:r>
+              <w:t>ETH</w:t>
+            </w:r>
+          </w:p>
+        </w:tc>
+        <w:tc>
+          <w:tcPr>
+            <w:tcW w:type="dxa" w:w="2160"/>
+          </w:tcPr>
+          <w:p>
+            <w:r>
+              <w:t>+0.70%</w:t>
+            </w:r>
+          </w:p>
+        </w:tc>
+        <w:tc>
+          <w:tcPr>
+            <w:tcW w:type="dxa" w:w="2160"/>
+          </w:tcPr>
+          <w:p>
+            <w:r>
+              <w:t>0.5</w:t>
+            </w:r>
+          </w:p>
+        </w:tc>
+        <w:tc>
+          <w:tcPr>
+            <w:tcW w:type="dxa" w:w="2160"/>
+          </w:tcPr>
+          <w:p>
+            <w:r>
+              <w:t>1.05</w:t>
+            </w:r>
+          </w:p>
+        </w:tc>
+      </w:tr>
+      <w:tr>
+        <w:tc>
+          <w:tcPr>
+            <w:tcW w:type="dxa" w:w="2160"/>
+          </w:tcPr>
+          <w:p>
+            <w:r>
+              <w:t>NEAR</w:t>
+            </w:r>
+          </w:p>
+        </w:tc>
+        <w:tc>
+          <w:tcPr>
+            <w:tcW w:type="dxa" w:w="2160"/>
+          </w:tcPr>
+          <w:p>
+            <w:r>
+              <w:t>-1.61%</w:t>
+            </w:r>
+          </w:p>
+        </w:tc>
+        <w:tc>
+          <w:tcPr>
+            <w:tcW w:type="dxa" w:w="2160"/>
+          </w:tcPr>
+          <w:p>
+            <w:r>
+              <w:t>0.5</w:t>
+            </w:r>
+          </w:p>
+        </w:tc>
+        <w:tc>
+          <w:tcPr>
+            <w:tcW w:type="dxa" w:w="2160"/>
+          </w:tcPr>
+          <w:p>
+            <w:r>
+              <w:t>1.00</w:t>
             </w:r>
           </w:p>
         </w:tc>
@@ -421,7 +515,7 @@
     <w:p/>
     <w:p>
       <w:r>
-        <w:t>Average: +1.21% | Profitable: 4/10 instruments</w:t>
+        <w:t>Average: +11.17% | Profitable: 9/10</w:t>
       </w:r>
     </w:p>
     <w:p>
@@ -429,154 +523,19 @@
         <w:pStyle w:val="Heading1"/>
       </w:pPr>
       <w:r>
-        <w:t>3. Trailing Stop Implementation</w:t>
+        <w:t>3. Trailing Stop</w:t>
       </w:r>
     </w:p>
     <w:p>
       <w:r>
-        <w:t>The strategy uses fixed stop/profit levels based on entry price:</w:t>
+        <w:t>StopLoss: EntryPrice * 0.97 (-3%)</w:t>
       </w:r>
     </w:p>
-    <w:tbl>
-      <w:tblPr>
-        <w:tblStyle w:val="TableGrid"/>
-        <w:tblW w:type="auto" w:w="0"/>
-        <w:tblLook w:firstColumn="1" w:firstRow="1" w:lastColumn="0" w:lastRow="0" w:noHBand="0" w:noVBand="1" w:val="04A0"/>
-      </w:tblPr>
-      <w:tblGrid>
-        <w:gridCol w:w="2880"/>
-        <w:gridCol w:w="2880"/>
-        <w:gridCol w:w="2880"/>
-      </w:tblGrid>
-      <w:tr>
-        <w:tc>
-          <w:tcPr>
-            <w:tcW w:type="dxa" w:w="2880"/>
-          </w:tcPr>
-          <w:p>
-            <w:r>
-              <w:t>Level</w:t>
-            </w:r>
-          </w:p>
-        </w:tc>
-        <w:tc>
-          <w:tcPr>
-            <w:tcW w:type="dxa" w:w="2880"/>
-          </w:tcPr>
-          <w:p>
-            <w:r>
-              <w:t>Formula</w:t>
-            </w:r>
-          </w:p>
-        </w:tc>
-        <w:tc>
-          <w:tcPr>
-            <w:tcW w:type="dxa" w:w="2880"/>
-          </w:tcPr>
-          <w:p>
-            <w:r>
-              <w:t>Description</w:t>
-            </w:r>
-          </w:p>
-        </w:tc>
-      </w:tr>
-      <w:tr>
-        <w:tc>
-          <w:tcPr>
-            <w:tcW w:type="dxa" w:w="2880"/>
-          </w:tcPr>
-          <w:p>
-            <w:r>
-              <w:t>StopLevel</w:t>
-            </w:r>
-          </w:p>
-        </w:tc>
-        <w:tc>
-          <w:tcPr>
-            <w:tcW w:type="dxa" w:w="2880"/>
-          </w:tcPr>
-          <w:p>
-            <w:r>
-              <w:t>EntryPrice * 0.97</w:t>
-            </w:r>
-          </w:p>
-        </w:tc>
-        <w:tc>
-          <w:tcPr>
-            <w:tcW w:type="dxa" w:w="2880"/>
-          </w:tcPr>
-          <w:p>
-            <w:r>
-              <w:t>Stop loss at -3% from entry</w:t>
-            </w:r>
-          </w:p>
-        </w:tc>
-      </w:tr>
-      <w:tr>
-        <w:tc>
-          <w:tcPr>
-            <w:tcW w:type="dxa" w:w="2880"/>
-          </w:tcPr>
-          <w:p>
-            <w:r>
-              <w:t>ProfitLevel</w:t>
-            </w:r>
-          </w:p>
-        </w:tc>
-        <w:tc>
-          <w:tcPr>
-            <w:tcW w:type="dxa" w:w="2880"/>
-          </w:tcPr>
-          <w:p>
-            <w:r>
-              <w:t>EntryPrice * 1.04</w:t>
-            </w:r>
-          </w:p>
-        </w:tc>
-        <w:tc>
-          <w:tcPr>
-            <w:tcW w:type="dxa" w:w="2880"/>
-          </w:tcPr>
-          <w:p>
-            <w:r>
-              <w:t>Take profit at +4% from entry</w:t>
-            </w:r>
-          </w:p>
-        </w:tc>
-      </w:tr>
-      <w:tr>
-        <w:tc>
-          <w:tcPr>
-            <w:tcW w:type="dxa" w:w="2880"/>
-          </w:tcPr>
-          <w:p>
-            <w:r>
-              <w:t>TrailLevel</w:t>
-            </w:r>
-          </w:p>
-        </w:tc>
-        <w:tc>
-          <w:tcPr>
-            <w:tcW w:type="dxa" w:w="2880"/>
-          </w:tcPr>
-          <w:p>
-            <w:r>
-              <w:t>Close * 0.985</w:t>
-            </w:r>
-          </w:p>
-        </w:tc>
-        <w:tc>
-          <w:tcPr>
-            <w:tcW w:type="dxa" w:w="2880"/>
-          </w:tcPr>
-          <w:p>
-            <w:r>
-              <w:t>Trailing stop at -1.5% from current</w:t>
-            </w:r>
-          </w:p>
-        </w:tc>
-      </w:tr>
-    </w:tbl>
+    <w:p>
+      <w:r>
+        <w:t>TakeProfit: EntryPrice * 1.04 (+4%)</w:t>
+      </w:r>
+    </w:p>
     <w:p>
       <w:pPr>
         <w:pStyle w:val="Heading1"/>
@@ -586,8 +545,11 @@
       </w:r>
     </w:p>
     <w:p>
+      <w:pPr>
+        <w:pStyle w:val="ListBullet"/>
+      </w:pPr>
       <w:r>
-        <w:t>Active scripts with trailing stop:</w:t>
+        <w:t>NN_AAVE (AAVEUSD_PERP)</w:t>
       </w:r>
     </w:p>
     <w:p>
@@ -595,7 +557,7 @@
         <w:pStyle w:val="ListBullet"/>
       </w:pPr>
       <w:r>
-        <w:t>NN_AAVE (AAVEUSD_PERP) - +24.05%</w:t>
+        <w:t>NN_SOL (SOLUSD_PERP)</w:t>
       </w:r>
     </w:p>
     <w:p>
@@ -603,7 +565,7 @@
         <w:pStyle w:val="ListBullet"/>
       </w:pPr>
       <w:r>
-        <w:t>NN_SOL (SOLUSD_PERP) - +12.87%</w:t>
+        <w:t>NN_XLM (XLMUSD_PERP)</w:t>
       </w:r>
     </w:p>
     <w:p>
@@ -611,7 +573,7 @@
         <w:pStyle w:val="ListBullet"/>
       </w:pPr>
       <w:r>
-        <w:t>NN_XLM (XLMUSD_PERP) - +15.85%</w:t>
+        <w:t>NN_NEAR (NEARUSD_PERP)</w:t>
       </w:r>
     </w:p>
     <w:p>
@@ -619,7 +581,31 @@
         <w:pStyle w:val="ListBullet"/>
       </w:pPr>
       <w:r>
-        <w:t>NN_NEAR (NEARUSD_PERP) - +17.74%</w:t>
+        <w:t>NN_LINK (LINKUSD_PERP)</w:t>
+      </w:r>
+    </w:p>
+    <w:p>
+      <w:pPr>
+        <w:pStyle w:val="ListBullet"/>
+      </w:pPr>
+      <w:r>
+        <w:t>NN_UNI (UNIUSD_PERP)</w:t>
+      </w:r>
+    </w:p>
+    <w:p>
+      <w:pPr>
+        <w:pStyle w:val="ListBullet"/>
+      </w:pPr>
+      <w:r>
+        <w:t>NN_BTC (BTCUSD_PERP)</w:t>
+      </w:r>
+    </w:p>
+    <w:p>
+      <w:pPr>
+        <w:pStyle w:val="ListBullet"/>
+      </w:pPr>
+      <w:r>
+        <w:t>NN_ETH (ETHUSD_PERP)</w:t>
       </w:r>
     </w:p>
     <w:p>
@@ -640,28 +626,6 @@
         <w:gridCol w:w="4320"/>
         <w:gridCol w:w="4320"/>
       </w:tblGrid>
-      <w:tr>
-        <w:tc>
-          <w:tcPr>
-            <w:tcW w:type="dxa" w:w="4320"/>
-          </w:tcPr>
-          <w:p>
-            <w:r>
-              <w:t>Parameter</w:t>
-            </w:r>
-          </w:p>
-        </w:tc>
-        <w:tc>
-          <w:tcPr>
-            <w:tcW w:type="dxa" w:w="4320"/>
-          </w:tcPr>
-          <w:p>
-            <w:r>
-              <w:t>Value</w:t>
-            </w:r>
-          </w:p>
-        </w:tc>
-      </w:tr>
       <w:tr>
         <w:tc>
           <w:tcPr>
@@ -691,7 +655,7 @@
           </w:tcPr>
           <w:p>
             <w:r>
-              <w:t>Risk per trade</w:t>
+              <w:t>Risk</w:t>
             </w:r>
           </w:p>
         </w:tc>
@@ -735,7 +699,7 @@
           </w:tcPr>
           <w:p>
             <w:r>
-              <w:t>Stop Loss</w:t>
+              <w:t>Reinvest</w:t>
             </w:r>
           </w:p>
         </w:tc>
@@ -745,7 +709,7 @@
           </w:tcPr>
           <w:p>
             <w:r>
-              <w:t>-3%</w:t>
+              <w:t>10%-50%</w:t>
             </w:r>
           </w:p>
         </w:tc>
@@ -757,7 +721,7 @@
           </w:tcPr>
           <w:p>
             <w:r>
-              <w:t>Take Profit</w:t>
+              <w:t>Commission</w:t>
             </w:r>
           </w:p>
         </w:tc>
@@ -767,60 +731,12 @@
           </w:tcPr>
           <w:p>
             <w:r>
-              <w:t>+4%</w:t>
+              <w:t>0.1%</w:t>
             </w:r>
           </w:p>
         </w:tc>
       </w:tr>
     </w:tbl>
-    <w:p>
-      <w:pPr>
-        <w:pStyle w:val="Heading1"/>
-      </w:pPr>
-      <w:r>
-        <w:t>6. Setup Instructions</w:t>
-      </w:r>
-    </w:p>
-    <w:p>
-      <w:pPr>
-        <w:pStyle w:val="ListNumber"/>
-      </w:pPr>
-      <w:r>
-        <w:t>1. Copy ONNX DLLs to TSLab directory</w:t>
-      </w:r>
-    </w:p>
-    <w:p>
-      <w:pPr>
-        <w:pStyle w:val="ListNumber"/>
-      </w:pPr>
-      <w:r>
-        <w:t>2. Upload IndicatorHandlers.dll</w:t>
-      </w:r>
-    </w:p>
-    <w:p>
-      <w:pPr>
-        <w:pStyle w:val="ListNumber"/>
-      </w:pPr>
-      <w:r>
-        <w:t>3. Configure Binance Testnet API keys</w:t>
-      </w:r>
-    </w:p>
-    <w:p>
-      <w:pPr>
-        <w:pStyle w:val="ListNumber"/>
-      </w:pPr>
-      <w:r>
-        <w:t>4. Open scripts in TSLab Desktop</w:t>
-      </w:r>
-    </w:p>
-    <w:p>
-      <w:pPr>
-        <w:pStyle w:val="ListNumber"/>
-      </w:pPr>
-      <w:r>
-        <w:t>5. Click Run to start trading</w:t>
-      </w:r>
-    </w:p>
     <w:sectPr>
       <w:pgSz w:w="12240" w:h="15840"/>
       <w:pgMar w:top="1440" w:right="1800" w:bottom="1440" w:left="1800" w:header="720" w:footer="720" w:gutter="0"/>

</xml_diff>

<commit_message>
refactor: clean up legacy files
- Remove debug, test, and duplicate files
- Clean up old optimization scripts
- Delete Gerchik book and C# indicator files
- Remove download and check scripts
- Delete extra report files
- Clean up 3D visualization files
- Keep core trading pipeline files
- Add new BTC analysis, calibration, ONNX export scripts
</commit_message>
<xml_diff>
--- a/TsLabWorkspace/nn-trading/NN_Trading_Final_Report.docx
+++ b/TsLabWorkspace/nn-trading/NN_Trading_Final_Report.docx
@@ -5,15 +5,24 @@
     <w:p>
       <w:pPr>
         <w:pStyle w:val="Title"/>
-        <w:jc w:val="center"/>
       </w:pPr>
       <w:r>
-        <w:t>NN Trading Strategy - Final Report</w:t>
+        <w:rPr>
+          <w:color w:val="003366"/>
+        </w:rPr>
+        <w:t>Neural Trading System v3</w:t>
       </w:r>
     </w:p>
     <w:p>
       <w:r>
-        <w:t>Updated: 10.07.2026 with 12 instruments</w:t>
+        <w:t>Расширенный отчёт по результатам тестирования</w:t>
+        <w:br/>
+        <w:t>на таймфреймах 1мин, 15мин, 1день</w:t>
+      </w:r>
+    </w:p>
+    <w:p>
+      <w:r>
+        <w:t>Дата: Июль 2026</w:t>
       </w:r>
     </w:p>
     <w:p>
@@ -21,12 +30,24 @@
         <w:pStyle w:val="Heading1"/>
       </w:pPr>
       <w:r>
-        <w:t>1. System Overview</w:t>
+        <w:rPr>
+          <w:color w:val="003366"/>
+        </w:rPr>
+        <w:t>1. Резюме</w:t>
       </w:r>
     </w:p>
     <w:p>
       <w:r>
-        <w:t>Neural network trading strategy for Binance Coin-Margined Futures using ensemble of TCN, LSTM, Transformer, and Attention models with per-instrument optimization.</w:t>
+        <w:t>Проведено тестирование нейросетевой торговой системы на трёх таймфреймах:</w:t>
+        <w:br/>
+        <w:t>- 1день (daily): лучший таймфрейм, 9/11 инструментов прибыльны</w:t>
+        <w:br/>
+        <w:t>- 15мин (intraday): все убыточны из-за шума и комиссий</w:t>
+        <w:br/>
+        <w:t>- 1мин (scalping): все убыточны, RL модель не успевает обучиться</w:t>
+        <w:br/>
+        <w:br/>
+        <w:t>Основной вывод: система эффективна на дневном таймфрейме, требует доработки для интрадей и скальпинга.</w:t>
       </w:r>
     </w:p>
     <w:p>
@@ -34,59 +55,114 @@
         <w:pStyle w:val="Heading1"/>
       </w:pPr>
       <w:r>
-        <w:t>2. Backtest Results (30 days, new data)</w:t>
+        <w:rPr>
+          <w:color w:val="003366"/>
+        </w:rPr>
+        <w:t>2. Оптимизированная модель: 1день</w:t>
+      </w:r>
+    </w:p>
+    <w:p>
+      <w:pPr>
+        <w:pStyle w:val="Heading2"/>
+      </w:pPr>
+      <w:r>
+        <w:rPr>
+          <w:color w:val="003366"/>
+        </w:rPr>
+        <w:t>2.1 Walk-forward результаты (5 фолдов)</w:t>
       </w:r>
     </w:p>
     <w:tbl>
       <w:tblPr>
-        <w:tblStyle w:val="TableGrid"/>
+        <w:tblStyle w:val="LightGrid-Accent1"/>
         <w:tblW w:type="auto" w:w="0"/>
+        <w:jc w:val="center"/>
         <w:tblLook w:firstColumn="1" w:firstRow="1" w:lastColumn="0" w:lastRow="0" w:noHBand="0" w:noVBand="1" w:val="04A0"/>
       </w:tblPr>
       <w:tblGrid>
-        <w:gridCol w:w="2160"/>
-        <w:gridCol w:w="2160"/>
-        <w:gridCol w:w="2160"/>
-        <w:gridCol w:w="2160"/>
+        <w:gridCol w:w="1440"/>
+        <w:gridCol w:w="1440"/>
+        <w:gridCol w:w="1440"/>
+        <w:gridCol w:w="1440"/>
+        <w:gridCol w:w="1440"/>
+        <w:gridCol w:w="1440"/>
       </w:tblGrid>
       <w:tr>
         <w:tc>
           <w:tcPr>
-            <w:tcW w:type="dxa" w:w="2160"/>
+            <w:tcW w:type="dxa" w:w="1440"/>
           </w:tcPr>
           <w:p>
             <w:r>
-              <w:t>Instrument</w:t>
+              <w:rPr>
+                <w:b/>
+              </w:rPr>
+              <w:t>Инструмент</w:t>
             </w:r>
           </w:p>
         </w:tc>
         <w:tc>
           <w:tcPr>
-            <w:tcW w:type="dxa" w:w="2160"/>
+            <w:tcW w:type="dxa" w:w="1440"/>
           </w:tcPr>
           <w:p>
             <w:r>
+              <w:rPr>
+                <w:b/>
+              </w:rPr>
               <w:t>Return</w:t>
             </w:r>
           </w:p>
         </w:tc>
         <w:tc>
           <w:tcPr>
-            <w:tcW w:type="dxa" w:w="2160"/>
+            <w:tcW w:type="dxa" w:w="1440"/>
           </w:tcPr>
           <w:p>
             <w:r>
-              <w:t>Threshold</w:t>
+              <w:rPr>
+                <w:b/>
+              </w:rPr>
+              <w:t>Sharpe</w:t>
             </w:r>
           </w:p>
         </w:tc>
         <w:tc>
           <w:tcPr>
-            <w:tcW w:type="dxa" w:w="2160"/>
+            <w:tcW w:type="dxa" w:w="1440"/>
           </w:tcPr>
           <w:p>
             <w:r>
-              <w:t>PF</w:t>
+              <w:rPr>
+                <w:b/>
+              </w:rPr>
+              <w:t>Trades</w:t>
+            </w:r>
+          </w:p>
+        </w:tc>
+        <w:tc>
+          <w:tcPr>
+            <w:tcW w:type="dxa" w:w="1440"/>
+          </w:tcPr>
+          <w:p>
+            <w:r>
+              <w:rPr>
+                <w:b/>
+              </w:rPr>
+              <w:t>Win%</w:t>
+            </w:r>
+          </w:p>
+        </w:tc>
+        <w:tc>
+          <w:tcPr>
+            <w:tcW w:type="dxa" w:w="1440"/>
+          </w:tcPr>
+          <w:p>
+            <w:r>
+              <w:rPr>
+                <w:b/>
+              </w:rPr>
+              <w:t>Статус</w:t>
             </w:r>
           </w:p>
         </w:tc>
@@ -94,7 +170,317 @@
       <w:tr>
         <w:tc>
           <w:tcPr>
-            <w:tcW w:type="dxa" w:w="2160"/>
+            <w:tcW w:type="dxa" w:w="1440"/>
+          </w:tcPr>
+          <w:p>
+            <w:r>
+              <w:t>SOL</w:t>
+            </w:r>
+          </w:p>
+        </w:tc>
+        <w:tc>
+          <w:tcPr>
+            <w:tcW w:type="dxa" w:w="1440"/>
+          </w:tcPr>
+          <w:p>
+            <w:r>
+              <w:t>+87.44%</w:t>
+            </w:r>
+          </w:p>
+        </w:tc>
+        <w:tc>
+          <w:tcPr>
+            <w:tcW w:type="dxa" w:w="1440"/>
+          </w:tcPr>
+          <w:p>
+            <w:r>
+              <w:t>2.09</w:t>
+            </w:r>
+          </w:p>
+        </w:tc>
+        <w:tc>
+          <w:tcPr>
+            <w:tcW w:type="dxa" w:w="1440"/>
+          </w:tcPr>
+          <w:p>
+            <w:r>
+              <w:t>748</w:t>
+            </w:r>
+          </w:p>
+        </w:tc>
+        <w:tc>
+          <w:tcPr>
+            <w:tcW w:type="dxa" w:w="1440"/>
+          </w:tcPr>
+          <w:p>
+            <w:r>
+              <w:t>38.9%</w:t>
+            </w:r>
+          </w:p>
+        </w:tc>
+        <w:tc>
+          <w:tcPr>
+            <w:tcW w:type="dxa" w:w="1440"/>
+          </w:tcPr>
+          <w:p>
+            <w:r>
+              <w:t>Торговать</w:t>
+            </w:r>
+          </w:p>
+        </w:tc>
+      </w:tr>
+      <w:tr>
+        <w:tc>
+          <w:tcPr>
+            <w:tcW w:type="dxa" w:w="1440"/>
+          </w:tcPr>
+          <w:p>
+            <w:r>
+              <w:t>NEAR</w:t>
+            </w:r>
+          </w:p>
+        </w:tc>
+        <w:tc>
+          <w:tcPr>
+            <w:tcW w:type="dxa" w:w="1440"/>
+          </w:tcPr>
+          <w:p>
+            <w:r>
+              <w:t>+85.77%</w:t>
+            </w:r>
+          </w:p>
+        </w:tc>
+        <w:tc>
+          <w:tcPr>
+            <w:tcW w:type="dxa" w:w="1440"/>
+          </w:tcPr>
+          <w:p>
+            <w:r>
+              <w:t>1.89</w:t>
+            </w:r>
+          </w:p>
+        </w:tc>
+        <w:tc>
+          <w:tcPr>
+            <w:tcW w:type="dxa" w:w="1440"/>
+          </w:tcPr>
+          <w:p>
+            <w:r>
+              <w:t>752</w:t>
+            </w:r>
+          </w:p>
+        </w:tc>
+        <w:tc>
+          <w:tcPr>
+            <w:tcW w:type="dxa" w:w="1440"/>
+          </w:tcPr>
+          <w:p>
+            <w:r>
+              <w:t>35.8%</w:t>
+            </w:r>
+          </w:p>
+        </w:tc>
+        <w:tc>
+          <w:tcPr>
+            <w:tcW w:type="dxa" w:w="1440"/>
+          </w:tcPr>
+          <w:p>
+            <w:r>
+              <w:t>Торговать</w:t>
+            </w:r>
+          </w:p>
+        </w:tc>
+      </w:tr>
+      <w:tr>
+        <w:tc>
+          <w:tcPr>
+            <w:tcW w:type="dxa" w:w="1440"/>
+          </w:tcPr>
+          <w:p>
+            <w:r>
+              <w:t>AAVE</w:t>
+            </w:r>
+          </w:p>
+        </w:tc>
+        <w:tc>
+          <w:tcPr>
+            <w:tcW w:type="dxa" w:w="1440"/>
+          </w:tcPr>
+          <w:p>
+            <w:r>
+              <w:t>+82.00%</w:t>
+            </w:r>
+          </w:p>
+        </w:tc>
+        <w:tc>
+          <w:tcPr>
+            <w:tcW w:type="dxa" w:w="1440"/>
+          </w:tcPr>
+          <w:p>
+            <w:r>
+              <w:t>1.86</w:t>
+            </w:r>
+          </w:p>
+        </w:tc>
+        <w:tc>
+          <w:tcPr>
+            <w:tcW w:type="dxa" w:w="1440"/>
+          </w:tcPr>
+          <w:p>
+            <w:r>
+              <w:t>745</w:t>
+            </w:r>
+          </w:p>
+        </w:tc>
+        <w:tc>
+          <w:tcPr>
+            <w:tcW w:type="dxa" w:w="1440"/>
+          </w:tcPr>
+          <w:p>
+            <w:r>
+              <w:t>36.2%</w:t>
+            </w:r>
+          </w:p>
+        </w:tc>
+        <w:tc>
+          <w:tcPr>
+            <w:tcW w:type="dxa" w:w="1440"/>
+          </w:tcPr>
+          <w:p>
+            <w:r>
+              <w:t>Торговать</w:t>
+            </w:r>
+          </w:p>
+        </w:tc>
+      </w:tr>
+      <w:tr>
+        <w:tc>
+          <w:tcPr>
+            <w:tcW w:type="dxa" w:w="1440"/>
+          </w:tcPr>
+          <w:p>
+            <w:r>
+              <w:t>SUI</w:t>
+            </w:r>
+          </w:p>
+        </w:tc>
+        <w:tc>
+          <w:tcPr>
+            <w:tcW w:type="dxa" w:w="1440"/>
+          </w:tcPr>
+          <w:p>
+            <w:r>
+              <w:t>+77.21%</w:t>
+            </w:r>
+          </w:p>
+        </w:tc>
+        <w:tc>
+          <w:tcPr>
+            <w:tcW w:type="dxa" w:w="1440"/>
+          </w:tcPr>
+          <w:p>
+            <w:r>
+              <w:t>2.80</w:t>
+            </w:r>
+          </w:p>
+        </w:tc>
+        <w:tc>
+          <w:tcPr>
+            <w:tcW w:type="dxa" w:w="1440"/>
+          </w:tcPr>
+          <w:p>
+            <w:r>
+              <w:t>482</w:t>
+            </w:r>
+          </w:p>
+        </w:tc>
+        <w:tc>
+          <w:tcPr>
+            <w:tcW w:type="dxa" w:w="1440"/>
+          </w:tcPr>
+          <w:p>
+            <w:r>
+              <w:t>38.4%</w:t>
+            </w:r>
+          </w:p>
+        </w:tc>
+        <w:tc>
+          <w:tcPr>
+            <w:tcW w:type="dxa" w:w="1440"/>
+          </w:tcPr>
+          <w:p>
+            <w:r>
+              <w:t>Торговать</w:t>
+            </w:r>
+          </w:p>
+        </w:tc>
+      </w:tr>
+      <w:tr>
+        <w:tc>
+          <w:tcPr>
+            <w:tcW w:type="dxa" w:w="1440"/>
+          </w:tcPr>
+          <w:p>
+            <w:r>
+              <w:t>LINK</w:t>
+            </w:r>
+          </w:p>
+        </w:tc>
+        <w:tc>
+          <w:tcPr>
+            <w:tcW w:type="dxa" w:w="1440"/>
+          </w:tcPr>
+          <w:p>
+            <w:r>
+              <w:t>+43.00%</w:t>
+            </w:r>
+          </w:p>
+        </w:tc>
+        <w:tc>
+          <w:tcPr>
+            <w:tcW w:type="dxa" w:w="1440"/>
+          </w:tcPr>
+          <w:p>
+            <w:r>
+              <w:t>1.23</w:t>
+            </w:r>
+          </w:p>
+        </w:tc>
+        <w:tc>
+          <w:tcPr>
+            <w:tcW w:type="dxa" w:w="1440"/>
+          </w:tcPr>
+          <w:p>
+            <w:r>
+              <w:t>748</w:t>
+            </w:r>
+          </w:p>
+        </w:tc>
+        <w:tc>
+          <w:tcPr>
+            <w:tcW w:type="dxa" w:w="1440"/>
+          </w:tcPr>
+          <w:p>
+            <w:r>
+              <w:t>35.7%</w:t>
+            </w:r>
+          </w:p>
+        </w:tc>
+        <w:tc>
+          <w:tcPr>
+            <w:tcW w:type="dxa" w:w="1440"/>
+          </w:tcPr>
+          <w:p>
+            <w:r>
+              <w:t>Торговать</w:t>
+            </w:r>
+          </w:p>
+        </w:tc>
+      </w:tr>
+      <w:tr>
+        <w:tc>
+          <w:tcPr>
+            <w:tcW w:type="dxa" w:w="1440"/>
           </w:tcPr>
           <w:p>
             <w:r>
@@ -104,31 +490,51 @@
         </w:tc>
         <w:tc>
           <w:tcPr>
-            <w:tcW w:type="dxa" w:w="2160"/>
+            <w:tcW w:type="dxa" w:w="1440"/>
           </w:tcPr>
           <w:p>
             <w:r>
-              <w:t>+66.42%</w:t>
+              <w:t>+27.11%</w:t>
             </w:r>
           </w:p>
         </w:tc>
         <w:tc>
           <w:tcPr>
-            <w:tcW w:type="dxa" w:w="2160"/>
+            <w:tcW w:type="dxa" w:w="1440"/>
           </w:tcPr>
           <w:p>
             <w:r>
-              <w:t>0.4</w:t>
+              <w:t>0.73</w:t>
             </w:r>
           </w:p>
         </w:tc>
         <w:tc>
           <w:tcPr>
-            <w:tcW w:type="dxa" w:w="2160"/>
+            <w:tcW w:type="dxa" w:w="1440"/>
           </w:tcPr>
           <w:p>
             <w:r>
-              <w:t>1.12</w:t>
+              <w:t>745</w:t>
+            </w:r>
+          </w:p>
+        </w:tc>
+        <w:tc>
+          <w:tcPr>
+            <w:tcW w:type="dxa" w:w="1440"/>
+          </w:tcPr>
+          <w:p>
+            <w:r>
+              <w:t>32.4%</w:t>
+            </w:r>
+          </w:p>
+        </w:tc>
+        <w:tc>
+          <w:tcPr>
+            <w:tcW w:type="dxa" w:w="1440"/>
+          </w:tcPr>
+          <w:p>
+            <w:r>
+              <w:t>Торговать</w:t>
             </w:r>
           </w:p>
         </w:tc>
@@ -136,41 +542,61 @@
       <w:tr>
         <w:tc>
           <w:tcPr>
-            <w:tcW w:type="dxa" w:w="2160"/>
+            <w:tcW w:type="dxa" w:w="1440"/>
           </w:tcPr>
           <w:p>
             <w:r>
-              <w:t>LINK</w:t>
+              <w:t>ADA</w:t>
             </w:r>
           </w:p>
         </w:tc>
         <w:tc>
           <w:tcPr>
-            <w:tcW w:type="dxa" w:w="2160"/>
+            <w:tcW w:type="dxa" w:w="1440"/>
           </w:tcPr>
           <w:p>
             <w:r>
-              <w:t>+11.97%</w:t>
+              <w:t>+24.69%</w:t>
             </w:r>
           </w:p>
         </w:tc>
         <w:tc>
           <w:tcPr>
-            <w:tcW w:type="dxa" w:w="2160"/>
+            <w:tcW w:type="dxa" w:w="1440"/>
           </w:tcPr>
           <w:p>
             <w:r>
-              <w:t>0.6</w:t>
+              <w:t>0.79</w:t>
             </w:r>
           </w:p>
         </w:tc>
         <w:tc>
           <w:tcPr>
-            <w:tcW w:type="dxa" w:w="2160"/>
+            <w:tcW w:type="dxa" w:w="1440"/>
           </w:tcPr>
           <w:p>
             <w:r>
-              <w:t>1.13</w:t>
+              <w:t>740</w:t>
+            </w:r>
+          </w:p>
+        </w:tc>
+        <w:tc>
+          <w:tcPr>
+            <w:tcW w:type="dxa" w:w="1440"/>
+          </w:tcPr>
+          <w:p>
+            <w:r>
+              <w:t>35.7%</w:t>
+            </w:r>
+          </w:p>
+        </w:tc>
+        <w:tc>
+          <w:tcPr>
+            <w:tcW w:type="dxa" w:w="1440"/>
+          </w:tcPr>
+          <w:p>
+            <w:r>
+              <w:t>Торговать</w:t>
             </w:r>
           </w:p>
         </w:tc>
@@ -178,7 +604,69 @@
       <w:tr>
         <w:tc>
           <w:tcPr>
-            <w:tcW w:type="dxa" w:w="2160"/>
+            <w:tcW w:type="dxa" w:w="1440"/>
+          </w:tcPr>
+          <w:p>
+            <w:r>
+              <w:t>BCH</w:t>
+            </w:r>
+          </w:p>
+        </w:tc>
+        <w:tc>
+          <w:tcPr>
+            <w:tcW w:type="dxa" w:w="1440"/>
+          </w:tcPr>
+          <w:p>
+            <w:r>
+              <w:t>+13.73%</w:t>
+            </w:r>
+          </w:p>
+        </w:tc>
+        <w:tc>
+          <w:tcPr>
+            <w:tcW w:type="dxa" w:w="1440"/>
+          </w:tcPr>
+          <w:p>
+            <w:r>
+              <w:t>0.35</w:t>
+            </w:r>
+          </w:p>
+        </w:tc>
+        <w:tc>
+          <w:tcPr>
+            <w:tcW w:type="dxa" w:w="1440"/>
+          </w:tcPr>
+          <w:p>
+            <w:r>
+              <w:t>742</w:t>
+            </w:r>
+          </w:p>
+        </w:tc>
+        <w:tc>
+          <w:tcPr>
+            <w:tcW w:type="dxa" w:w="1440"/>
+          </w:tcPr>
+          <w:p>
+            <w:r>
+              <w:t>31.3%</w:t>
+            </w:r>
+          </w:p>
+        </w:tc>
+        <w:tc>
+          <w:tcPr>
+            <w:tcW w:type="dxa" w:w="1440"/>
+          </w:tcPr>
+          <w:p>
+            <w:r>
+              <w:t>Торговать</w:t>
+            </w:r>
+          </w:p>
+        </w:tc>
+      </w:tr>
+      <w:tr>
+        <w:tc>
+          <w:tcPr>
+            <w:tcW w:type="dxa" w:w="1440"/>
           </w:tcPr>
           <w:p>
             <w:r>
@@ -188,31 +676,51 @@
         </w:tc>
         <w:tc>
           <w:tcPr>
-            <w:tcW w:type="dxa" w:w="2160"/>
+            <w:tcW w:type="dxa" w:w="1440"/>
           </w:tcPr>
           <w:p>
             <w:r>
-              <w:t>+10.62%</w:t>
+              <w:t>+5.69%</w:t>
             </w:r>
           </w:p>
         </w:tc>
         <w:tc>
           <w:tcPr>
-            <w:tcW w:type="dxa" w:w="2160"/>
+            <w:tcW w:type="dxa" w:w="1440"/>
           </w:tcPr>
           <w:p>
             <w:r>
-              <w:t>0.5</w:t>
+              <w:t>0.06</w:t>
             </w:r>
           </w:p>
         </w:tc>
         <w:tc>
           <w:tcPr>
-            <w:tcW w:type="dxa" w:w="2160"/>
+            <w:tcW w:type="dxa" w:w="1440"/>
           </w:tcPr>
           <w:p>
             <w:r>
-              <w:t>1.04</w:t>
+              <w:t>735</w:t>
+            </w:r>
+          </w:p>
+        </w:tc>
+        <w:tc>
+          <w:tcPr>
+            <w:tcW w:type="dxa" w:w="1440"/>
+          </w:tcPr>
+          <w:p>
+            <w:r>
+              <w:t>33.5%</w:t>
+            </w:r>
+          </w:p>
+        </w:tc>
+        <w:tc>
+          <w:tcPr>
+            <w:tcW w:type="dxa" w:w="1440"/>
+          </w:tcPr>
+          <w:p>
+            <w:r>
+              <w:t>Наблюдать</w:t>
             </w:r>
           </w:p>
         </w:tc>
@@ -220,41 +728,61 @@
       <w:tr>
         <w:tc>
           <w:tcPr>
-            <w:tcW w:type="dxa" w:w="2160"/>
+            <w:tcW w:type="dxa" w:w="1440"/>
           </w:tcPr>
           <w:p>
             <w:r>
-              <w:t>AAVE</w:t>
+              <w:t>Bitcoin</w:t>
             </w:r>
           </w:p>
         </w:tc>
         <w:tc>
           <w:tcPr>
-            <w:tcW w:type="dxa" w:w="2160"/>
+            <w:tcW w:type="dxa" w:w="1440"/>
           </w:tcPr>
           <w:p>
             <w:r>
-              <w:t>+8.61%</w:t>
+              <w:t>-54.68%</w:t>
             </w:r>
           </w:p>
         </w:tc>
         <w:tc>
           <w:tcPr>
-            <w:tcW w:type="dxa" w:w="2160"/>
+            <w:tcW w:type="dxa" w:w="1440"/>
           </w:tcPr>
           <w:p>
             <w:r>
-              <w:t>0.5</w:t>
+              <w:t>-2.56</w:t>
             </w:r>
           </w:p>
         </w:tc>
         <w:tc>
           <w:tcPr>
-            <w:tcW w:type="dxa" w:w="2160"/>
+            <w:tcW w:type="dxa" w:w="1440"/>
           </w:tcPr>
           <w:p>
             <w:r>
-              <w:t>1.40</w:t>
+              <w:t>682</w:t>
+            </w:r>
+          </w:p>
+        </w:tc>
+        <w:tc>
+          <w:tcPr>
+            <w:tcW w:type="dxa" w:w="1440"/>
+          </w:tcPr>
+          <w:p>
+            <w:r>
+              <w:t>27.9%</w:t>
+            </w:r>
+          </w:p>
+        </w:tc>
+        <w:tc>
+          <w:tcPr>
+            <w:tcW w:type="dxa" w:w="1440"/>
+          </w:tcPr>
+          <w:p>
+            <w:r>
+              <w:t>Убыточный</w:t>
             </w:r>
           </w:p>
         </w:tc>
@@ -262,364 +790,98 @@
       <w:tr>
         <w:tc>
           <w:tcPr>
-            <w:tcW w:type="dxa" w:w="2160"/>
+            <w:tcW w:type="dxa" w:w="1440"/>
           </w:tcPr>
           <w:p>
             <w:r>
-              <w:t>SOL</w:t>
+              <w:t>TRX</w:t>
             </w:r>
           </w:p>
         </w:tc>
         <w:tc>
           <w:tcPr>
-            <w:tcW w:type="dxa" w:w="2160"/>
+            <w:tcW w:type="dxa" w:w="1440"/>
           </w:tcPr>
           <w:p>
             <w:r>
-              <w:t>+6.84%</w:t>
+              <w:t>-62.67%</w:t>
             </w:r>
           </w:p>
         </w:tc>
         <w:tc>
           <w:tcPr>
-            <w:tcW w:type="dxa" w:w="2160"/>
+            <w:tcW w:type="dxa" w:w="1440"/>
           </w:tcPr>
           <w:p>
             <w:r>
-              <w:t>0.5</w:t>
+              <w:t>-3.32</w:t>
             </w:r>
           </w:p>
         </w:tc>
         <w:tc>
           <w:tcPr>
-            <w:tcW w:type="dxa" w:w="2160"/>
+            <w:tcW w:type="dxa" w:w="1440"/>
           </w:tcPr>
           <w:p>
             <w:r>
-              <w:t>1.04</w:t>
-            </w:r>
-          </w:p>
-        </w:tc>
-      </w:tr>
-      <w:tr>
-        <w:tc>
-          <w:tcPr>
-            <w:tcW w:type="dxa" w:w="2160"/>
-          </w:tcPr>
-          <w:p>
-            <w:r>
-              <w:t>AVAX</w:t>
+              <w:t>660</w:t>
             </w:r>
           </w:p>
         </w:tc>
         <w:tc>
           <w:tcPr>
-            <w:tcW w:type="dxa" w:w="2160"/>
+            <w:tcW w:type="dxa" w:w="1440"/>
           </w:tcPr>
           <w:p>
             <w:r>
-              <w:t>+3.37%</w:t>
+              <w:t>26.3%</w:t>
             </w:r>
           </w:p>
         </w:tc>
         <w:tc>
           <w:tcPr>
-            <w:tcW w:type="dxa" w:w="2160"/>
+            <w:tcW w:type="dxa" w:w="1440"/>
           </w:tcPr>
           <w:p>
             <w:r>
-              <w:t>0.4</w:t>
-            </w:r>
-          </w:p>
-        </w:tc>
-        <w:tc>
-          <w:tcPr>
-            <w:tcW w:type="dxa" w:w="2160"/>
-          </w:tcPr>
-          <w:p>
-            <w:r>
-              <w:t>1.02</w:t>
-            </w:r>
-          </w:p>
-        </w:tc>
-      </w:tr>
-      <w:tr>
-        <w:tc>
-          <w:tcPr>
-            <w:tcW w:type="dxa" w:w="2160"/>
-          </w:tcPr>
-          <w:p>
-            <w:r>
-              <w:t>BTC</w:t>
-            </w:r>
-          </w:p>
-        </w:tc>
-        <w:tc>
-          <w:tcPr>
-            <w:tcW w:type="dxa" w:w="2160"/>
-          </w:tcPr>
-          <w:p>
-            <w:r>
-              <w:t>+2.82%</w:t>
-            </w:r>
-          </w:p>
-        </w:tc>
-        <w:tc>
-          <w:tcPr>
-            <w:tcW w:type="dxa" w:w="2160"/>
-          </w:tcPr>
-          <w:p>
-            <w:r>
-              <w:t>0.3</w:t>
-            </w:r>
-          </w:p>
-        </w:tc>
-        <w:tc>
-          <w:tcPr>
-            <w:tcW w:type="dxa" w:w="2160"/>
-          </w:tcPr>
-          <w:p>
-            <w:r>
-              <w:t>1.02</w:t>
-            </w:r>
-          </w:p>
-        </w:tc>
-      </w:tr>
-      <w:tr>
-        <w:tc>
-          <w:tcPr>
-            <w:tcW w:type="dxa" w:w="2160"/>
-          </w:tcPr>
-          <w:p>
-            <w:r>
-              <w:t>ADA</w:t>
-            </w:r>
-          </w:p>
-        </w:tc>
-        <w:tc>
-          <w:tcPr>
-            <w:tcW w:type="dxa" w:w="2160"/>
-          </w:tcPr>
-          <w:p>
-            <w:r>
-              <w:t>+1.90%</w:t>
-            </w:r>
-          </w:p>
-        </w:tc>
-        <w:tc>
-          <w:tcPr>
-            <w:tcW w:type="dxa" w:w="2160"/>
-          </w:tcPr>
-          <w:p>
-            <w:r>
-              <w:t>0.5</w:t>
-            </w:r>
-          </w:p>
-        </w:tc>
-        <w:tc>
-          <w:tcPr>
-            <w:tcW w:type="dxa" w:w="2160"/>
-          </w:tcPr>
-          <w:p>
-            <w:r>
-              <w:t>1.01</w:t>
-            </w:r>
-          </w:p>
-        </w:tc>
-      </w:tr>
-      <w:tr>
-        <w:tc>
-          <w:tcPr>
-            <w:tcW w:type="dxa" w:w="2160"/>
-          </w:tcPr>
-          <w:p>
-            <w:r>
-              <w:t>ETH</w:t>
-            </w:r>
-          </w:p>
-        </w:tc>
-        <w:tc>
-          <w:tcPr>
-            <w:tcW w:type="dxa" w:w="2160"/>
-          </w:tcPr>
-          <w:p>
-            <w:r>
-              <w:t>+0.70%</w:t>
-            </w:r>
-          </w:p>
-        </w:tc>
-        <w:tc>
-          <w:tcPr>
-            <w:tcW w:type="dxa" w:w="2160"/>
-          </w:tcPr>
-          <w:p>
-            <w:r>
-              <w:t>0.5</w:t>
-            </w:r>
-          </w:p>
-        </w:tc>
-        <w:tc>
-          <w:tcPr>
-            <w:tcW w:type="dxa" w:w="2160"/>
-          </w:tcPr>
-          <w:p>
-            <w:r>
-              <w:t>1.05</w:t>
-            </w:r>
-          </w:p>
-        </w:tc>
-      </w:tr>
-      <w:tr>
-        <w:tc>
-          <w:tcPr>
-            <w:tcW w:type="dxa" w:w="2160"/>
-          </w:tcPr>
-          <w:p>
-            <w:r>
-              <w:t>NEAR</w:t>
-            </w:r>
-          </w:p>
-        </w:tc>
-        <w:tc>
-          <w:tcPr>
-            <w:tcW w:type="dxa" w:w="2160"/>
-          </w:tcPr>
-          <w:p>
-            <w:r>
-              <w:t>-1.61%</w:t>
-            </w:r>
-          </w:p>
-        </w:tc>
-        <w:tc>
-          <w:tcPr>
-            <w:tcW w:type="dxa" w:w="2160"/>
-          </w:tcPr>
-          <w:p>
-            <w:r>
-              <w:t>0.5</w:t>
-            </w:r>
-          </w:p>
-        </w:tc>
-        <w:tc>
-          <w:tcPr>
-            <w:tcW w:type="dxa" w:w="2160"/>
-          </w:tcPr>
-          <w:p>
-            <w:r>
-              <w:t>1.00</w:t>
+              <w:t>Убыточный</w:t>
             </w:r>
           </w:p>
         </w:tc>
       </w:tr>
     </w:tbl>
-    <w:p/>
     <w:p>
       <w:r>
-        <w:t>Average: +11.17% | Profitable: 9/10</w:t>
+        <w:br/>
+        <w:t>Прибыльных: 9/11 (82%)</w:t>
+      </w:r>
+    </w:p>
+    <w:p>
+      <w:r>
+        <w:t>Средняя доходность прибыльных: +49.7%</w:t>
+      </w:r>
+    </w:p>
+    <w:p>
+      <w:r>
+        <w:t>Лучший инструмент: SOL (+87.44%, Sharpe 2.09)</w:t>
       </w:r>
     </w:p>
     <w:p>
       <w:pPr>
-        <w:pStyle w:val="Heading1"/>
+        <w:pStyle w:val="Heading2"/>
       </w:pPr>
       <w:r>
-        <w:t>3. Trailing Stop</w:t>
-      </w:r>
-    </w:p>
-    <w:p>
-      <w:r>
-        <w:t>StopLoss: EntryPrice * 0.97 (-3%)</w:t>
-      </w:r>
-    </w:p>
-    <w:p>
-      <w:r>
-        <w:t>TakeProfit: EntryPrice * 1.04 (+4%)</w:t>
-      </w:r>
-    </w:p>
-    <w:p>
-      <w:pPr>
-        <w:pStyle w:val="Heading1"/>
-      </w:pPr>
-      <w:r>
-        <w:t>4. TSLab Scripts</w:t>
-      </w:r>
-    </w:p>
-    <w:p>
-      <w:pPr>
-        <w:pStyle w:val="ListBullet"/>
-      </w:pPr>
-      <w:r>
-        <w:t>NN_AAVE (AAVEUSD_PERP)</w:t>
-      </w:r>
-    </w:p>
-    <w:p>
-      <w:pPr>
-        <w:pStyle w:val="ListBullet"/>
-      </w:pPr>
-      <w:r>
-        <w:t>NN_SOL (SOLUSD_PERP)</w:t>
-      </w:r>
-    </w:p>
-    <w:p>
-      <w:pPr>
-        <w:pStyle w:val="ListBullet"/>
-      </w:pPr>
-      <w:r>
-        <w:t>NN_XLM (XLMUSD_PERP)</w:t>
-      </w:r>
-    </w:p>
-    <w:p>
-      <w:pPr>
-        <w:pStyle w:val="ListBullet"/>
-      </w:pPr>
-      <w:r>
-        <w:t>NN_NEAR (NEARUSD_PERP)</w:t>
-      </w:r>
-    </w:p>
-    <w:p>
-      <w:pPr>
-        <w:pStyle w:val="ListBullet"/>
-      </w:pPr>
-      <w:r>
-        <w:t>NN_LINK (LINKUSD_PERP)</w:t>
-      </w:r>
-    </w:p>
-    <w:p>
-      <w:pPr>
-        <w:pStyle w:val="ListBullet"/>
-      </w:pPr>
-      <w:r>
-        <w:t>NN_UNI (UNIUSD_PERP)</w:t>
-      </w:r>
-    </w:p>
-    <w:p>
-      <w:pPr>
-        <w:pStyle w:val="ListBullet"/>
-      </w:pPr>
-      <w:r>
-        <w:t>NN_BTC (BTCUSD_PERP)</w:t>
-      </w:r>
-    </w:p>
-    <w:p>
-      <w:pPr>
-        <w:pStyle w:val="ListBullet"/>
-      </w:pPr>
-      <w:r>
-        <w:t>NN_ETH (ETHUSD_PERP)</w:t>
-      </w:r>
-    </w:p>
-    <w:p>
-      <w:pPr>
-        <w:pStyle w:val="Heading1"/>
-      </w:pPr>
-      <w:r>
-        <w:t>5. Money Management</w:t>
+        <w:rPr>
+          <w:color w:val="003366"/>
+        </w:rPr>
+        <w:t>2.2 Оптимизированные параметры</w:t>
       </w:r>
     </w:p>
     <w:tbl>
       <w:tblPr>
-        <w:tblStyle w:val="TableGrid"/>
+        <w:tblStyle w:val="LightGrid-Accent1"/>
         <w:tblW w:type="auto" w:w="0"/>
+        <w:jc w:val="center"/>
         <w:tblLook w:firstColumn="1" w:firstRow="1" w:lastColumn="0" w:lastRow="0" w:noHBand="0" w:noVBand="1" w:val="04A0"/>
       </w:tblPr>
       <w:tblGrid>
@@ -633,7 +895,10 @@
           </w:tcPr>
           <w:p>
             <w:r>
-              <w:t>Deposit</w:t>
+              <w:rPr>
+                <w:b/>
+              </w:rPr>
+              <w:t>Параметр</w:t>
             </w:r>
           </w:p>
         </w:tc>
@@ -643,7 +908,10 @@
           </w:tcPr>
           <w:p>
             <w:r>
-              <w:t>70 USDT</w:t>
+              <w:rPr>
+                <w:b/>
+              </w:rPr>
+              <w:t>Значение</w:t>
             </w:r>
           </w:p>
         </w:tc>
@@ -655,7 +923,7 @@
           </w:tcPr>
           <w:p>
             <w:r>
-              <w:t>Risk</w:t>
+              <w:t>Window</w:t>
             </w:r>
           </w:p>
         </w:tc>
@@ -665,7 +933,7 @@
           </w:tcPr>
           <w:p>
             <w:r>
-              <w:t>1%-20%</w:t>
+              <w:t>30</w:t>
             </w:r>
           </w:p>
         </w:tc>
@@ -677,7 +945,7 @@
           </w:tcPr>
           <w:p>
             <w:r>
-              <w:t>Leverage</w:t>
+              <w:t>Hidden size</w:t>
             </w:r>
           </w:p>
         </w:tc>
@@ -687,7 +955,7 @@
           </w:tcPr>
           <w:p>
             <w:r>
-              <w:t>1x-30x</w:t>
+              <w:t>32</w:t>
             </w:r>
           </w:p>
         </w:tc>
@@ -699,7 +967,7 @@
           </w:tcPr>
           <w:p>
             <w:r>
-              <w:t>Reinvest</w:t>
+              <w:t>Num layers</w:t>
             </w:r>
           </w:p>
         </w:tc>
@@ -709,7 +977,139 @@
           </w:tcPr>
           <w:p>
             <w:r>
-              <w:t>10%-50%</w:t>
+              <w:t>2</w:t>
+            </w:r>
+          </w:p>
+        </w:tc>
+      </w:tr>
+      <w:tr>
+        <w:tc>
+          <w:tcPr>
+            <w:tcW w:type="dxa" w:w="4320"/>
+          </w:tcPr>
+          <w:p>
+            <w:r>
+              <w:t>Dropout</w:t>
+            </w:r>
+          </w:p>
+        </w:tc>
+        <w:tc>
+          <w:tcPr>
+            <w:tcW w:type="dxa" w:w="4320"/>
+          </w:tcPr>
+          <w:p>
+            <w:r>
+              <w:t>0.3</w:t>
+            </w:r>
+          </w:p>
+        </w:tc>
+      </w:tr>
+      <w:tr>
+        <w:tc>
+          <w:tcPr>
+            <w:tcW w:type="dxa" w:w="4320"/>
+          </w:tcPr>
+          <w:p>
+            <w:r>
+              <w:t>Batch size</w:t>
+            </w:r>
+          </w:p>
+        </w:tc>
+        <w:tc>
+          <w:tcPr>
+            <w:tcW w:type="dxa" w:w="4320"/>
+          </w:tcPr>
+          <w:p>
+            <w:r>
+              <w:t>128</w:t>
+            </w:r>
+          </w:p>
+        </w:tc>
+      </w:tr>
+      <w:tr>
+        <w:tc>
+          <w:tcPr>
+            <w:tcW w:type="dxa" w:w="4320"/>
+          </w:tcPr>
+          <w:p>
+            <w:r>
+              <w:t>Learning rate</w:t>
+            </w:r>
+          </w:p>
+        </w:tc>
+        <w:tc>
+          <w:tcPr>
+            <w:tcW w:type="dxa" w:w="4320"/>
+          </w:tcPr>
+          <w:p>
+            <w:r>
+              <w:t>0.0005</w:t>
+            </w:r>
+          </w:p>
+        </w:tc>
+      </w:tr>
+      <w:tr>
+        <w:tc>
+          <w:tcPr>
+            <w:tcW w:type="dxa" w:w="4320"/>
+          </w:tcPr>
+          <w:p>
+            <w:r>
+              <w:t>Max features</w:t>
+            </w:r>
+          </w:p>
+        </w:tc>
+        <w:tc>
+          <w:tcPr>
+            <w:tcW w:type="dxa" w:w="4320"/>
+          </w:tcPr>
+          <w:p>
+            <w:r>
+              <w:t>30</w:t>
+            </w:r>
+          </w:p>
+        </w:tc>
+      </w:tr>
+      <w:tr>
+        <w:tc>
+          <w:tcPr>
+            <w:tcW w:type="dxa" w:w="4320"/>
+          </w:tcPr>
+          <w:p>
+            <w:r>
+              <w:t>Stop loss</w:t>
+            </w:r>
+          </w:p>
+        </w:tc>
+        <w:tc>
+          <w:tcPr>
+            <w:tcW w:type="dxa" w:w="4320"/>
+          </w:tcPr>
+          <w:p>
+            <w:r>
+              <w:t>3%</w:t>
+            </w:r>
+          </w:p>
+        </w:tc>
+      </w:tr>
+      <w:tr>
+        <w:tc>
+          <w:tcPr>
+            <w:tcW w:type="dxa" w:w="4320"/>
+          </w:tcPr>
+          <w:p>
+            <w:r>
+              <w:t>Take profit</w:t>
+            </w:r>
+          </w:p>
+        </w:tc>
+        <w:tc>
+          <w:tcPr>
+            <w:tcW w:type="dxa" w:w="4320"/>
+          </w:tcPr>
+          <w:p>
+            <w:r>
+              <w:t>7%</w:t>
             </w:r>
           </w:p>
         </w:tc>
@@ -736,7 +1136,2082 @@
           </w:p>
         </w:tc>
       </w:tr>
+      <w:tr>
+        <w:tc>
+          <w:tcPr>
+            <w:tcW w:type="dxa" w:w="4320"/>
+          </w:tcPr>
+          <w:p>
+            <w:r>
+              <w:t>Trailing stop</w:t>
+            </w:r>
+          </w:p>
+        </w:tc>
+        <w:tc>
+          <w:tcPr>
+            <w:tcW w:type="dxa" w:w="4320"/>
+          </w:tcPr>
+          <w:p>
+            <w:r>
+              <w:t>1%</w:t>
+            </w:r>
+          </w:p>
+        </w:tc>
+      </w:tr>
     </w:tbl>
+    <w:p>
+      <w:pPr>
+        <w:pStyle w:val="Heading1"/>
+      </w:pPr>
+      <w:r>
+        <w:rPr>
+          <w:color w:val="003366"/>
+        </w:rPr>
+        <w:t>3. RL модель: 1мин</w:t>
+      </w:r>
+    </w:p>
+    <w:p>
+      <w:r>
+        <w:t>Обучена DQN RL модель (Dueling DQN + Double DQN) на 1мин данных.</w:t>
+        <w:br/>
+        <w:t>Параметры: window=8, episodes=15, commission=0.2%</w:t>
+        <w:br/>
+        <w:t>Результат: все инструменты убыточны.</w:t>
+      </w:r>
+    </w:p>
+    <w:tbl>
+      <w:tblPr>
+        <w:tblStyle w:val="LightGrid-Accent1"/>
+        <w:tblW w:type="auto" w:w="0"/>
+        <w:jc w:val="center"/>
+        <w:tblLook w:firstColumn="1" w:firstRow="1" w:lastColumn="0" w:lastRow="0" w:noHBand="0" w:noVBand="1" w:val="04A0"/>
+      </w:tblPr>
+      <w:tblGrid>
+        <w:gridCol w:w="1728"/>
+        <w:gridCol w:w="1728"/>
+        <w:gridCol w:w="1728"/>
+        <w:gridCol w:w="1728"/>
+        <w:gridCol w:w="1728"/>
+      </w:tblGrid>
+      <w:tr>
+        <w:tc>
+          <w:tcPr>
+            <w:tcW w:type="dxa" w:w="1728"/>
+          </w:tcPr>
+          <w:p>
+            <w:r>
+              <w:rPr>
+                <w:b/>
+              </w:rPr>
+              <w:t>Инструмент</w:t>
+            </w:r>
+          </w:p>
+        </w:tc>
+        <w:tc>
+          <w:tcPr>
+            <w:tcW w:type="dxa" w:w="1728"/>
+          </w:tcPr>
+          <w:p>
+            <w:r>
+              <w:rPr>
+                <w:b/>
+              </w:rPr>
+              <w:t>Return</w:t>
+            </w:r>
+          </w:p>
+        </w:tc>
+        <w:tc>
+          <w:tcPr>
+            <w:tcW w:type="dxa" w:w="1728"/>
+          </w:tcPr>
+          <w:p>
+            <w:r>
+              <w:rPr>
+                <w:b/>
+              </w:rPr>
+              <w:t>Trades</w:t>
+            </w:r>
+          </w:p>
+        </w:tc>
+        <w:tc>
+          <w:tcPr>
+            <w:tcW w:type="dxa" w:w="1728"/>
+          </w:tcPr>
+          <w:p>
+            <w:r>
+              <w:rPr>
+                <w:b/>
+              </w:rPr>
+              <w:t>Win%</w:t>
+            </w:r>
+          </w:p>
+        </w:tc>
+        <w:tc>
+          <w:tcPr>
+            <w:tcW w:type="dxa" w:w="1728"/>
+          </w:tcPr>
+          <w:p>
+            <w:r>
+              <w:rPr>
+                <w:b/>
+              </w:rPr>
+              <w:t>Статус</w:t>
+            </w:r>
+          </w:p>
+        </w:tc>
+      </w:tr>
+      <w:tr>
+        <w:tc>
+          <w:tcPr>
+            <w:tcW w:type="dxa" w:w="1728"/>
+          </w:tcPr>
+          <w:p>
+            <w:r>
+              <w:t>XLM</w:t>
+            </w:r>
+          </w:p>
+        </w:tc>
+        <w:tc>
+          <w:tcPr>
+            <w:tcW w:type="dxa" w:w="1728"/>
+          </w:tcPr>
+          <w:p>
+            <w:r>
+              <w:t>-0.48%</w:t>
+            </w:r>
+          </w:p>
+        </w:tc>
+        <w:tc>
+          <w:tcPr>
+            <w:tcW w:type="dxa" w:w="1728"/>
+          </w:tcPr>
+          <w:p>
+            <w:r>
+              <w:t>2</w:t>
+            </w:r>
+          </w:p>
+        </w:tc>
+        <w:tc>
+          <w:tcPr>
+            <w:tcW w:type="dxa" w:w="1728"/>
+          </w:tcPr>
+          <w:p>
+            <w:r>
+              <w:t>50.0%</w:t>
+            </w:r>
+          </w:p>
+        </w:tc>
+        <w:tc>
+          <w:tcPr>
+            <w:tcW w:type="dxa" w:w="1728"/>
+          </w:tcPr>
+          <w:p>
+            <w:r>
+              <w:t>Мало сделок</w:t>
+            </w:r>
+          </w:p>
+        </w:tc>
+      </w:tr>
+      <w:tr>
+        <w:tc>
+          <w:tcPr>
+            <w:tcW w:type="dxa" w:w="1728"/>
+          </w:tcPr>
+          <w:p>
+            <w:r>
+              <w:t>Bitcoin</w:t>
+            </w:r>
+          </w:p>
+        </w:tc>
+        <w:tc>
+          <w:tcPr>
+            <w:tcW w:type="dxa" w:w="1728"/>
+          </w:tcPr>
+          <w:p>
+            <w:r>
+              <w:t>-1.12%</w:t>
+            </w:r>
+          </w:p>
+        </w:tc>
+        <w:tc>
+          <w:tcPr>
+            <w:tcW w:type="dxa" w:w="1728"/>
+          </w:tcPr>
+          <w:p>
+            <w:r>
+              <w:t>4</w:t>
+            </w:r>
+          </w:p>
+        </w:tc>
+        <w:tc>
+          <w:tcPr>
+            <w:tcW w:type="dxa" w:w="1728"/>
+          </w:tcPr>
+          <w:p>
+            <w:r>
+              <w:t>25.0%</w:t>
+            </w:r>
+          </w:p>
+        </w:tc>
+        <w:tc>
+          <w:tcPr>
+            <w:tcW w:type="dxa" w:w="1728"/>
+          </w:tcPr>
+          <w:p>
+            <w:r>
+              <w:t>Убыточный</w:t>
+            </w:r>
+          </w:p>
+        </w:tc>
+      </w:tr>
+      <w:tr>
+        <w:tc>
+          <w:tcPr>
+            <w:tcW w:type="dxa" w:w="1728"/>
+          </w:tcPr>
+          <w:p>
+            <w:r>
+              <w:t>Ethereum</w:t>
+            </w:r>
+          </w:p>
+        </w:tc>
+        <w:tc>
+          <w:tcPr>
+            <w:tcW w:type="dxa" w:w="1728"/>
+          </w:tcPr>
+          <w:p>
+            <w:r>
+              <w:t>-1.22%</w:t>
+            </w:r>
+          </w:p>
+        </w:tc>
+        <w:tc>
+          <w:tcPr>
+            <w:tcW w:type="dxa" w:w="1728"/>
+          </w:tcPr>
+          <w:p>
+            <w:r>
+              <w:t>3</w:t>
+            </w:r>
+          </w:p>
+        </w:tc>
+        <w:tc>
+          <w:tcPr>
+            <w:tcW w:type="dxa" w:w="1728"/>
+          </w:tcPr>
+          <w:p>
+            <w:r>
+              <w:t>0.0%</w:t>
+            </w:r>
+          </w:p>
+        </w:tc>
+        <w:tc>
+          <w:tcPr>
+            <w:tcW w:type="dxa" w:w="1728"/>
+          </w:tcPr>
+          <w:p>
+            <w:r>
+              <w:t>Убыточный</w:t>
+            </w:r>
+          </w:p>
+        </w:tc>
+      </w:tr>
+      <w:tr>
+        <w:tc>
+          <w:tcPr>
+            <w:tcW w:type="dxa" w:w="1728"/>
+          </w:tcPr>
+          <w:p>
+            <w:r>
+              <w:t>TRX</w:t>
+            </w:r>
+          </w:p>
+        </w:tc>
+        <w:tc>
+          <w:tcPr>
+            <w:tcW w:type="dxa" w:w="1728"/>
+          </w:tcPr>
+          <w:p>
+            <w:r>
+              <w:t>-1.45%</w:t>
+            </w:r>
+          </w:p>
+        </w:tc>
+        <w:tc>
+          <w:tcPr>
+            <w:tcW w:type="dxa" w:w="1728"/>
+          </w:tcPr>
+          <w:p>
+            <w:r>
+              <w:t>4</w:t>
+            </w:r>
+          </w:p>
+        </w:tc>
+        <w:tc>
+          <w:tcPr>
+            <w:tcW w:type="dxa" w:w="1728"/>
+          </w:tcPr>
+          <w:p>
+            <w:r>
+              <w:t>50.0%</w:t>
+            </w:r>
+          </w:p>
+        </w:tc>
+        <w:tc>
+          <w:tcPr>
+            <w:tcW w:type="dxa" w:w="1728"/>
+          </w:tcPr>
+          <w:p>
+            <w:r>
+              <w:t>Убыточный</w:t>
+            </w:r>
+          </w:p>
+        </w:tc>
+      </w:tr>
+      <w:tr>
+        <w:tc>
+          <w:tcPr>
+            <w:tcW w:type="dxa" w:w="1728"/>
+          </w:tcPr>
+          <w:p>
+            <w:r>
+              <w:t>SUI</w:t>
+            </w:r>
+          </w:p>
+        </w:tc>
+        <w:tc>
+          <w:tcPr>
+            <w:tcW w:type="dxa" w:w="1728"/>
+          </w:tcPr>
+          <w:p>
+            <w:r>
+              <w:t>-1.55%</w:t>
+            </w:r>
+          </w:p>
+        </w:tc>
+        <w:tc>
+          <w:tcPr>
+            <w:tcW w:type="dxa" w:w="1728"/>
+          </w:tcPr>
+          <w:p>
+            <w:r>
+              <w:t>5</w:t>
+            </w:r>
+          </w:p>
+        </w:tc>
+        <w:tc>
+          <w:tcPr>
+            <w:tcW w:type="dxa" w:w="1728"/>
+          </w:tcPr>
+          <w:p>
+            <w:r>
+              <w:t>80.0%</w:t>
+            </w:r>
+          </w:p>
+        </w:tc>
+        <w:tc>
+          <w:tcPr>
+            <w:tcW w:type="dxa" w:w="1728"/>
+          </w:tcPr>
+          <w:p>
+            <w:r>
+              <w:t>Убыточный</w:t>
+            </w:r>
+          </w:p>
+        </w:tc>
+      </w:tr>
+      <w:tr>
+        <w:tc>
+          <w:tcPr>
+            <w:tcW w:type="dxa" w:w="1728"/>
+          </w:tcPr>
+          <w:p>
+            <w:r>
+              <w:t>NEAR</w:t>
+            </w:r>
+          </w:p>
+        </w:tc>
+        <w:tc>
+          <w:tcPr>
+            <w:tcW w:type="dxa" w:w="1728"/>
+          </w:tcPr>
+          <w:p>
+            <w:r>
+              <w:t>-2.28%</w:t>
+            </w:r>
+          </w:p>
+        </w:tc>
+        <w:tc>
+          <w:tcPr>
+            <w:tcW w:type="dxa" w:w="1728"/>
+          </w:tcPr>
+          <w:p>
+            <w:r>
+              <w:t>3</w:t>
+            </w:r>
+          </w:p>
+        </w:tc>
+        <w:tc>
+          <w:tcPr>
+            <w:tcW w:type="dxa" w:w="1728"/>
+          </w:tcPr>
+          <w:p>
+            <w:r>
+              <w:t>33.3%</w:t>
+            </w:r>
+          </w:p>
+        </w:tc>
+        <w:tc>
+          <w:tcPr>
+            <w:tcW w:type="dxa" w:w="1728"/>
+          </w:tcPr>
+          <w:p>
+            <w:r>
+              <w:t>Убыточный</w:t>
+            </w:r>
+          </w:p>
+        </w:tc>
+      </w:tr>
+      <w:tr>
+        <w:tc>
+          <w:tcPr>
+            <w:tcW w:type="dxa" w:w="1728"/>
+          </w:tcPr>
+          <w:p>
+            <w:r>
+              <w:t>ADA</w:t>
+            </w:r>
+          </w:p>
+        </w:tc>
+        <w:tc>
+          <w:tcPr>
+            <w:tcW w:type="dxa" w:w="1728"/>
+          </w:tcPr>
+          <w:p>
+            <w:r>
+              <w:t>-2.60%</w:t>
+            </w:r>
+          </w:p>
+        </w:tc>
+        <w:tc>
+          <w:tcPr>
+            <w:tcW w:type="dxa" w:w="1728"/>
+          </w:tcPr>
+          <w:p>
+            <w:r>
+              <w:t>3</w:t>
+            </w:r>
+          </w:p>
+        </w:tc>
+        <w:tc>
+          <w:tcPr>
+            <w:tcW w:type="dxa" w:w="1728"/>
+          </w:tcPr>
+          <w:p>
+            <w:r>
+              <w:t>33.3%</w:t>
+            </w:r>
+          </w:p>
+        </w:tc>
+        <w:tc>
+          <w:tcPr>
+            <w:tcW w:type="dxa" w:w="1728"/>
+          </w:tcPr>
+          <w:p>
+            <w:r>
+              <w:t>Убыточный</w:t>
+            </w:r>
+          </w:p>
+        </w:tc>
+      </w:tr>
+      <w:tr>
+        <w:tc>
+          <w:tcPr>
+            <w:tcW w:type="dxa" w:w="1728"/>
+          </w:tcPr>
+          <w:p>
+            <w:r>
+              <w:t>BCH</w:t>
+            </w:r>
+          </w:p>
+        </w:tc>
+        <w:tc>
+          <w:tcPr>
+            <w:tcW w:type="dxa" w:w="1728"/>
+          </w:tcPr>
+          <w:p>
+            <w:r>
+              <w:t>-2.62%</w:t>
+            </w:r>
+          </w:p>
+        </w:tc>
+        <w:tc>
+          <w:tcPr>
+            <w:tcW w:type="dxa" w:w="1728"/>
+          </w:tcPr>
+          <w:p>
+            <w:r>
+              <w:t>2</w:t>
+            </w:r>
+          </w:p>
+        </w:tc>
+        <w:tc>
+          <w:tcPr>
+            <w:tcW w:type="dxa" w:w="1728"/>
+          </w:tcPr>
+          <w:p>
+            <w:r>
+              <w:t>0.0%</w:t>
+            </w:r>
+          </w:p>
+        </w:tc>
+        <w:tc>
+          <w:tcPr>
+            <w:tcW w:type="dxa" w:w="1728"/>
+          </w:tcPr>
+          <w:p>
+            <w:r>
+              <w:t>Убыточный</w:t>
+            </w:r>
+          </w:p>
+        </w:tc>
+      </w:tr>
+      <w:tr>
+        <w:tc>
+          <w:tcPr>
+            <w:tcW w:type="dxa" w:w="1728"/>
+          </w:tcPr>
+          <w:p>
+            <w:r>
+              <w:t>UNI</w:t>
+            </w:r>
+          </w:p>
+        </w:tc>
+        <w:tc>
+          <w:tcPr>
+            <w:tcW w:type="dxa" w:w="1728"/>
+          </w:tcPr>
+          <w:p>
+            <w:r>
+              <w:t>-2.87%</w:t>
+            </w:r>
+          </w:p>
+        </w:tc>
+        <w:tc>
+          <w:tcPr>
+            <w:tcW w:type="dxa" w:w="1728"/>
+          </w:tcPr>
+          <w:p>
+            <w:r>
+              <w:t>7</w:t>
+            </w:r>
+          </w:p>
+        </w:tc>
+        <w:tc>
+          <w:tcPr>
+            <w:tcW w:type="dxa" w:w="1728"/>
+          </w:tcPr>
+          <w:p>
+            <w:r>
+              <w:t>42.9%</w:t>
+            </w:r>
+          </w:p>
+        </w:tc>
+        <w:tc>
+          <w:tcPr>
+            <w:tcW w:type="dxa" w:w="1728"/>
+          </w:tcPr>
+          <w:p>
+            <w:r>
+              <w:t>Убыточный</w:t>
+            </w:r>
+          </w:p>
+        </w:tc>
+      </w:tr>
+      <w:tr>
+        <w:tc>
+          <w:tcPr>
+            <w:tcW w:type="dxa" w:w="1728"/>
+          </w:tcPr>
+          <w:p>
+            <w:r>
+              <w:t>SOL</w:t>
+            </w:r>
+          </w:p>
+        </w:tc>
+        <w:tc>
+          <w:tcPr>
+            <w:tcW w:type="dxa" w:w="1728"/>
+          </w:tcPr>
+          <w:p>
+            <w:r>
+              <w:t>-3.34%</w:t>
+            </w:r>
+          </w:p>
+        </w:tc>
+        <w:tc>
+          <w:tcPr>
+            <w:tcW w:type="dxa" w:w="1728"/>
+          </w:tcPr>
+          <w:p>
+            <w:r>
+              <w:t>4</w:t>
+            </w:r>
+          </w:p>
+        </w:tc>
+        <w:tc>
+          <w:tcPr>
+            <w:tcW w:type="dxa" w:w="1728"/>
+          </w:tcPr>
+          <w:p>
+            <w:r>
+              <w:t>0.0%</w:t>
+            </w:r>
+          </w:p>
+        </w:tc>
+        <w:tc>
+          <w:tcPr>
+            <w:tcW w:type="dxa" w:w="1728"/>
+          </w:tcPr>
+          <w:p>
+            <w:r>
+              <w:t>Убыточный</w:t>
+            </w:r>
+          </w:p>
+        </w:tc>
+      </w:tr>
+      <w:tr>
+        <w:tc>
+          <w:tcPr>
+            <w:tcW w:type="dxa" w:w="1728"/>
+          </w:tcPr>
+          <w:p>
+            <w:r>
+              <w:t>AAVE</w:t>
+            </w:r>
+          </w:p>
+        </w:tc>
+        <w:tc>
+          <w:tcPr>
+            <w:tcW w:type="dxa" w:w="1728"/>
+          </w:tcPr>
+          <w:p>
+            <w:r>
+              <w:t>-1.39%</w:t>
+            </w:r>
+          </w:p>
+        </w:tc>
+        <w:tc>
+          <w:tcPr>
+            <w:tcW w:type="dxa" w:w="1728"/>
+          </w:tcPr>
+          <w:p>
+            <w:r>
+              <w:t>4</w:t>
+            </w:r>
+          </w:p>
+        </w:tc>
+        <w:tc>
+          <w:tcPr>
+            <w:tcW w:type="dxa" w:w="1728"/>
+          </w:tcPr>
+          <w:p>
+            <w:r>
+              <w:t>50.0%</w:t>
+            </w:r>
+          </w:p>
+        </w:tc>
+        <w:tc>
+          <w:tcPr>
+            <w:tcW w:type="dxa" w:w="1728"/>
+          </w:tcPr>
+          <w:p>
+            <w:r>
+              <w:t>Убыточный</w:t>
+            </w:r>
+          </w:p>
+        </w:tc>
+      </w:tr>
+      <w:tr>
+        <w:tc>
+          <w:tcPr>
+            <w:tcW w:type="dxa" w:w="1728"/>
+          </w:tcPr>
+          <w:p>
+            <w:r>
+              <w:t>LINK</w:t>
+            </w:r>
+          </w:p>
+        </w:tc>
+        <w:tc>
+          <w:tcPr>
+            <w:tcW w:type="dxa" w:w="1728"/>
+          </w:tcPr>
+          <w:p>
+            <w:r>
+              <w:t>-3.84%</w:t>
+            </w:r>
+          </w:p>
+        </w:tc>
+        <w:tc>
+          <w:tcPr>
+            <w:tcW w:type="dxa" w:w="1728"/>
+          </w:tcPr>
+          <w:p>
+            <w:r>
+              <w:t>5</w:t>
+            </w:r>
+          </w:p>
+        </w:tc>
+        <w:tc>
+          <w:tcPr>
+            <w:tcW w:type="dxa" w:w="1728"/>
+          </w:tcPr>
+          <w:p>
+            <w:r>
+              <w:t>0.0%</w:t>
+            </w:r>
+          </w:p>
+        </w:tc>
+        <w:tc>
+          <w:tcPr>
+            <w:tcW w:type="dxa" w:w="1728"/>
+          </w:tcPr>
+          <w:p>
+            <w:r>
+              <w:t>Убыточный</w:t>
+            </w:r>
+          </w:p>
+        </w:tc>
+      </w:tr>
+    </w:tbl>
+    <w:p>
+      <w:r>
+        <w:br/>
+        <w:t>Проблемы RL:</w:t>
+      </w:r>
+    </w:p>
+    <w:p>
+      <w:pPr>
+        <w:pStyle w:val="ListBullet"/>
+      </w:pPr>
+      <w:r>
+        <w:t>1. CPU обучение слишком медленное (15 эпох недостаточно)</w:t>
+      </w:r>
+    </w:p>
+    <w:p>
+      <w:pPr>
+        <w:pStyle w:val="ListBullet"/>
+      </w:pPr>
+      <w:r>
+        <w:t>2. Мало сделок (2-7 за тест)</w:t>
+      </w:r>
+    </w:p>
+    <w:p>
+      <w:pPr>
+        <w:pStyle w:val="ListBullet"/>
+      </w:pPr>
+      <w:r>
+        <w:t>3. 1мин данные слишком шумные</w:t>
+      </w:r>
+    </w:p>
+    <w:p>
+      <w:pPr>
+        <w:pStyle w:val="ListBullet"/>
+      </w:pPr>
+      <w:r>
+        <w:t>4. Комиссии 0.2% съедают малые прибыли</w:t>
+      </w:r>
+    </w:p>
+    <w:p>
+      <w:pPr>
+        <w:pStyle w:val="Heading1"/>
+      </w:pPr>
+      <w:r>
+        <w:rPr>
+          <w:color w:val="003366"/>
+        </w:rPr>
+        <w:t>4. Тестирование: 15мин</w:t>
+      </w:r>
+    </w:p>
+    <w:p>
+      <w:r>
+        <w:t>Walk-forward тестирование на 15мин данных показало:</w:t>
+        <w:br/>
+        <w:t>Все инструменты убыточны из-за высокого шума и комиссий.</w:t>
+      </w:r>
+    </w:p>
+    <w:tbl>
+      <w:tblPr>
+        <w:tblStyle w:val="LightGrid-Accent1"/>
+        <w:tblW w:type="auto" w:w="0"/>
+        <w:jc w:val="center"/>
+        <w:tblLook w:firstColumn="1" w:firstRow="1" w:lastColumn="0" w:lastRow="0" w:noHBand="0" w:noVBand="1" w:val="04A0"/>
+      </w:tblPr>
+      <w:tblGrid>
+        <w:gridCol w:w="1728"/>
+        <w:gridCol w:w="1728"/>
+        <w:gridCol w:w="1728"/>
+        <w:gridCol w:w="1728"/>
+        <w:gridCol w:w="1728"/>
+      </w:tblGrid>
+      <w:tr>
+        <w:tc>
+          <w:tcPr>
+            <w:tcW w:type="dxa" w:w="1728"/>
+          </w:tcPr>
+          <w:p>
+            <w:r>
+              <w:rPr>
+                <w:b/>
+              </w:rPr>
+              <w:t>Инструмент</w:t>
+            </w:r>
+          </w:p>
+        </w:tc>
+        <w:tc>
+          <w:tcPr>
+            <w:tcW w:type="dxa" w:w="1728"/>
+          </w:tcPr>
+          <w:p>
+            <w:r>
+              <w:rPr>
+                <w:b/>
+              </w:rPr>
+              <w:t>Return</w:t>
+            </w:r>
+          </w:p>
+        </w:tc>
+        <w:tc>
+          <w:tcPr>
+            <w:tcW w:type="dxa" w:w="1728"/>
+          </w:tcPr>
+          <w:p>
+            <w:r>
+              <w:rPr>
+                <w:b/>
+              </w:rPr>
+              <w:t>Sharpe</w:t>
+            </w:r>
+          </w:p>
+        </w:tc>
+        <w:tc>
+          <w:tcPr>
+            <w:tcW w:type="dxa" w:w="1728"/>
+          </w:tcPr>
+          <w:p>
+            <w:r>
+              <w:rPr>
+                <w:b/>
+              </w:rPr>
+              <w:t>Trades</w:t>
+            </w:r>
+          </w:p>
+        </w:tc>
+        <w:tc>
+          <w:tcPr>
+            <w:tcW w:type="dxa" w:w="1728"/>
+          </w:tcPr>
+          <w:p>
+            <w:r>
+              <w:rPr>
+                <w:b/>
+              </w:rPr>
+              <w:t>Win%</w:t>
+            </w:r>
+          </w:p>
+        </w:tc>
+      </w:tr>
+      <w:tr>
+        <w:tc>
+          <w:tcPr>
+            <w:tcW w:type="dxa" w:w="1728"/>
+          </w:tcPr>
+          <w:p>
+            <w:r>
+              <w:t>TRX</w:t>
+            </w:r>
+          </w:p>
+        </w:tc>
+        <w:tc>
+          <w:tcPr>
+            <w:tcW w:type="dxa" w:w="1728"/>
+          </w:tcPr>
+          <w:p>
+            <w:r>
+              <w:t>-21.62%</w:t>
+            </w:r>
+          </w:p>
+        </w:tc>
+        <w:tc>
+          <w:tcPr>
+            <w:tcW w:type="dxa" w:w="1728"/>
+          </w:tcPr>
+          <w:p>
+            <w:r>
+              <w:t>-1.50</w:t>
+            </w:r>
+          </w:p>
+        </w:tc>
+        <w:tc>
+          <w:tcPr>
+            <w:tcW w:type="dxa" w:w="1728"/>
+          </w:tcPr>
+          <w:p>
+            <w:r>
+              <w:t>58</w:t>
+            </w:r>
+          </w:p>
+        </w:tc>
+        <w:tc>
+          <w:tcPr>
+            <w:tcW w:type="dxa" w:w="1728"/>
+          </w:tcPr>
+          <w:p>
+            <w:r>
+              <w:t>22.8%</w:t>
+            </w:r>
+          </w:p>
+        </w:tc>
+      </w:tr>
+      <w:tr>
+        <w:tc>
+          <w:tcPr>
+            <w:tcW w:type="dxa" w:w="1728"/>
+          </w:tcPr>
+          <w:p>
+            <w:r>
+              <w:t>Bitcoin</w:t>
+            </w:r>
+          </w:p>
+        </w:tc>
+        <w:tc>
+          <w:tcPr>
+            <w:tcW w:type="dxa" w:w="1728"/>
+          </w:tcPr>
+          <w:p>
+            <w:r>
+              <w:t>-25.66%</w:t>
+            </w:r>
+          </w:p>
+        </w:tc>
+        <w:tc>
+          <w:tcPr>
+            <w:tcW w:type="dxa" w:w="1728"/>
+          </w:tcPr>
+          <w:p>
+            <w:r>
+              <w:t>-2.31</w:t>
+            </w:r>
+          </w:p>
+        </w:tc>
+        <w:tc>
+          <w:tcPr>
+            <w:tcW w:type="dxa" w:w="1728"/>
+          </w:tcPr>
+          <w:p>
+            <w:r>
+              <w:t>72</w:t>
+            </w:r>
+          </w:p>
+        </w:tc>
+        <w:tc>
+          <w:tcPr>
+            <w:tcW w:type="dxa" w:w="1728"/>
+          </w:tcPr>
+          <w:p>
+            <w:r>
+              <w:t>23.1%</w:t>
+            </w:r>
+          </w:p>
+        </w:tc>
+      </w:tr>
+      <w:tr>
+        <w:tc>
+          <w:tcPr>
+            <w:tcW w:type="dxa" w:w="1728"/>
+          </w:tcPr>
+          <w:p>
+            <w:r>
+              <w:t>BCH</w:t>
+            </w:r>
+          </w:p>
+        </w:tc>
+        <w:tc>
+          <w:tcPr>
+            <w:tcW w:type="dxa" w:w="1728"/>
+          </w:tcPr>
+          <w:p>
+            <w:r>
+              <w:t>-55.25%</w:t>
+            </w:r>
+          </w:p>
+        </w:tc>
+        <w:tc>
+          <w:tcPr>
+            <w:tcW w:type="dxa" w:w="1728"/>
+          </w:tcPr>
+          <w:p>
+            <w:r>
+              <w:t>-10.07</w:t>
+            </w:r>
+          </w:p>
+        </w:tc>
+        <w:tc>
+          <w:tcPr>
+            <w:tcW w:type="dxa" w:w="1728"/>
+          </w:tcPr>
+          <w:p>
+            <w:r>
+              <w:t>144</w:t>
+            </w:r>
+          </w:p>
+        </w:tc>
+        <w:tc>
+          <w:tcPr>
+            <w:tcW w:type="dxa" w:w="1728"/>
+          </w:tcPr>
+          <w:p>
+            <w:r>
+              <w:t>20.9%</w:t>
+            </w:r>
+          </w:p>
+        </w:tc>
+      </w:tr>
+      <w:tr>
+        <w:tc>
+          <w:tcPr>
+            <w:tcW w:type="dxa" w:w="1728"/>
+          </w:tcPr>
+          <w:p>
+            <w:r>
+              <w:t>SOL</w:t>
+            </w:r>
+          </w:p>
+        </w:tc>
+        <w:tc>
+          <w:tcPr>
+            <w:tcW w:type="dxa" w:w="1728"/>
+          </w:tcPr>
+          <w:p>
+            <w:r>
+              <w:t>-65.95%</w:t>
+            </w:r>
+          </w:p>
+        </w:tc>
+        <w:tc>
+          <w:tcPr>
+            <w:tcW w:type="dxa" w:w="1728"/>
+          </w:tcPr>
+          <w:p>
+            <w:r>
+              <w:t>-4.52</w:t>
+            </w:r>
+          </w:p>
+        </w:tc>
+        <w:tc>
+          <w:tcPr>
+            <w:tcW w:type="dxa" w:w="1728"/>
+          </w:tcPr>
+          <w:p>
+            <w:r>
+              <w:t>247</w:t>
+            </w:r>
+          </w:p>
+        </w:tc>
+        <w:tc>
+          <w:tcPr>
+            <w:tcW w:type="dxa" w:w="1728"/>
+          </w:tcPr>
+          <w:p>
+            <w:r>
+              <w:t>21.7%</w:t>
+            </w:r>
+          </w:p>
+        </w:tc>
+      </w:tr>
+      <w:tr>
+        <w:tc>
+          <w:tcPr>
+            <w:tcW w:type="dxa" w:w="1728"/>
+          </w:tcPr>
+          <w:p>
+            <w:r>
+              <w:t>Ethereum</w:t>
+            </w:r>
+          </w:p>
+        </w:tc>
+        <w:tc>
+          <w:tcPr>
+            <w:tcW w:type="dxa" w:w="1728"/>
+          </w:tcPr>
+          <w:p>
+            <w:r>
+              <w:t>-69.21%</w:t>
+            </w:r>
+          </w:p>
+        </w:tc>
+        <w:tc>
+          <w:tcPr>
+            <w:tcW w:type="dxa" w:w="1728"/>
+          </w:tcPr>
+          <w:p>
+            <w:r>
+              <w:t>-3.10</w:t>
+            </w:r>
+          </w:p>
+        </w:tc>
+        <w:tc>
+          <w:tcPr>
+            <w:tcW w:type="dxa" w:w="1728"/>
+          </w:tcPr>
+          <w:p>
+            <w:r>
+              <w:t>242</w:t>
+            </w:r>
+          </w:p>
+        </w:tc>
+        <w:tc>
+          <w:tcPr>
+            <w:tcW w:type="dxa" w:w="1728"/>
+          </w:tcPr>
+          <w:p>
+            <w:r>
+              <w:t>21.9%</w:t>
+            </w:r>
+          </w:p>
+        </w:tc>
+      </w:tr>
+      <w:tr>
+        <w:tc>
+          <w:tcPr>
+            <w:tcW w:type="dxa" w:w="1728"/>
+          </w:tcPr>
+          <w:p>
+            <w:r>
+              <w:t>UNI</w:t>
+            </w:r>
+          </w:p>
+        </w:tc>
+        <w:tc>
+          <w:tcPr>
+            <w:tcW w:type="dxa" w:w="1728"/>
+          </w:tcPr>
+          <w:p>
+            <w:r>
+              <w:t>-69.82%</w:t>
+            </w:r>
+          </w:p>
+        </w:tc>
+        <w:tc>
+          <w:tcPr>
+            <w:tcW w:type="dxa" w:w="1728"/>
+          </w:tcPr>
+          <w:p>
+            <w:r>
+              <w:t>-5.44</w:t>
+            </w:r>
+          </w:p>
+        </w:tc>
+        <w:tc>
+          <w:tcPr>
+            <w:tcW w:type="dxa" w:w="1728"/>
+          </w:tcPr>
+          <w:p>
+            <w:r>
+              <w:t>256</w:t>
+            </w:r>
+          </w:p>
+        </w:tc>
+        <w:tc>
+          <w:tcPr>
+            <w:tcW w:type="dxa" w:w="1728"/>
+          </w:tcPr>
+          <w:p>
+            <w:r>
+              <w:t>22.0%</w:t>
+            </w:r>
+          </w:p>
+        </w:tc>
+      </w:tr>
+      <w:tr>
+        <w:tc>
+          <w:tcPr>
+            <w:tcW w:type="dxa" w:w="1728"/>
+          </w:tcPr>
+          <w:p>
+            <w:r>
+              <w:t>LINK</w:t>
+            </w:r>
+          </w:p>
+        </w:tc>
+        <w:tc>
+          <w:tcPr>
+            <w:tcW w:type="dxa" w:w="1728"/>
+          </w:tcPr>
+          <w:p>
+            <w:r>
+              <w:t>-67.50%</w:t>
+            </w:r>
+          </w:p>
+        </w:tc>
+        <w:tc>
+          <w:tcPr>
+            <w:tcW w:type="dxa" w:w="1728"/>
+          </w:tcPr>
+          <w:p>
+            <w:r>
+              <w:t>-4.15</w:t>
+            </w:r>
+          </w:p>
+        </w:tc>
+        <w:tc>
+          <w:tcPr>
+            <w:tcW w:type="dxa" w:w="1728"/>
+          </w:tcPr>
+          <w:p>
+            <w:r>
+              <w:t>227</w:t>
+            </w:r>
+          </w:p>
+        </w:tc>
+        <w:tc>
+          <w:tcPr>
+            <w:tcW w:type="dxa" w:w="1728"/>
+          </w:tcPr>
+          <w:p>
+            <w:r>
+              <w:t>17.0%</w:t>
+            </w:r>
+          </w:p>
+        </w:tc>
+      </w:tr>
+      <w:tr>
+        <w:tc>
+          <w:tcPr>
+            <w:tcW w:type="dxa" w:w="1728"/>
+          </w:tcPr>
+          <w:p>
+            <w:r>
+              <w:t>SUI</w:t>
+            </w:r>
+          </w:p>
+        </w:tc>
+        <w:tc>
+          <w:tcPr>
+            <w:tcW w:type="dxa" w:w="1728"/>
+          </w:tcPr>
+          <w:p>
+            <w:r>
+              <w:t>-74.36%</w:t>
+            </w:r>
+          </w:p>
+        </w:tc>
+        <w:tc>
+          <w:tcPr>
+            <w:tcW w:type="dxa" w:w="1728"/>
+          </w:tcPr>
+          <w:p>
+            <w:r>
+              <w:t>-3.29</w:t>
+            </w:r>
+          </w:p>
+        </w:tc>
+        <w:tc>
+          <w:tcPr>
+            <w:tcW w:type="dxa" w:w="1728"/>
+          </w:tcPr>
+          <w:p>
+            <w:r>
+              <w:t>343</w:t>
+            </w:r>
+          </w:p>
+        </w:tc>
+        <w:tc>
+          <w:tcPr>
+            <w:tcW w:type="dxa" w:w="1728"/>
+          </w:tcPr>
+          <w:p>
+            <w:r>
+              <w:t>25.5%</w:t>
+            </w:r>
+          </w:p>
+        </w:tc>
+      </w:tr>
+      <w:tr>
+        <w:tc>
+          <w:tcPr>
+            <w:tcW w:type="dxa" w:w="1728"/>
+          </w:tcPr>
+          <w:p>
+            <w:r>
+              <w:t>AAVE</w:t>
+            </w:r>
+          </w:p>
+        </w:tc>
+        <w:tc>
+          <w:tcPr>
+            <w:tcW w:type="dxa" w:w="1728"/>
+          </w:tcPr>
+          <w:p>
+            <w:r>
+              <w:t>-79.32%</w:t>
+            </w:r>
+          </w:p>
+        </w:tc>
+        <w:tc>
+          <w:tcPr>
+            <w:tcW w:type="dxa" w:w="1728"/>
+          </w:tcPr>
+          <w:p>
+            <w:r>
+              <w:t>-3.02</w:t>
+            </w:r>
+          </w:p>
+        </w:tc>
+        <w:tc>
+          <w:tcPr>
+            <w:tcW w:type="dxa" w:w="1728"/>
+          </w:tcPr>
+          <w:p>
+            <w:r>
+              <w:t>305</w:t>
+            </w:r>
+          </w:p>
+        </w:tc>
+        <w:tc>
+          <w:tcPr>
+            <w:tcW w:type="dxa" w:w="1728"/>
+          </w:tcPr>
+          <w:p>
+            <w:r>
+              <w:t>17.1%</w:t>
+            </w:r>
+          </w:p>
+        </w:tc>
+      </w:tr>
+      <w:tr>
+        <w:tc>
+          <w:tcPr>
+            <w:tcW w:type="dxa" w:w="1728"/>
+          </w:tcPr>
+          <w:p>
+            <w:r>
+              <w:t>ADA</w:t>
+            </w:r>
+          </w:p>
+        </w:tc>
+        <w:tc>
+          <w:tcPr>
+            <w:tcW w:type="dxa" w:w="1728"/>
+          </w:tcPr>
+          <w:p>
+            <w:r>
+              <w:t>-91.10%</w:t>
+            </w:r>
+          </w:p>
+        </w:tc>
+        <w:tc>
+          <w:tcPr>
+            <w:tcW w:type="dxa" w:w="1728"/>
+          </w:tcPr>
+          <w:p>
+            <w:r>
+              <w:t>-4.57</w:t>
+            </w:r>
+          </w:p>
+        </w:tc>
+        <w:tc>
+          <w:tcPr>
+            <w:tcW w:type="dxa" w:w="1728"/>
+          </w:tcPr>
+          <w:p>
+            <w:r>
+              <w:t>438</w:t>
+            </w:r>
+          </w:p>
+        </w:tc>
+        <w:tc>
+          <w:tcPr>
+            <w:tcW w:type="dxa" w:w="1728"/>
+          </w:tcPr>
+          <w:p>
+            <w:r>
+              <w:t>18.0%</w:t>
+            </w:r>
+          </w:p>
+        </w:tc>
+      </w:tr>
+      <w:tr>
+        <w:tc>
+          <w:tcPr>
+            <w:tcW w:type="dxa" w:w="1728"/>
+          </w:tcPr>
+          <w:p>
+            <w:r>
+              <w:t>XLM</w:t>
+            </w:r>
+          </w:p>
+        </w:tc>
+        <w:tc>
+          <w:tcPr>
+            <w:tcW w:type="dxa" w:w="1728"/>
+          </w:tcPr>
+          <w:p>
+            <w:r>
+              <w:t>-86.13%</w:t>
+            </w:r>
+          </w:p>
+        </w:tc>
+        <w:tc>
+          <w:tcPr>
+            <w:tcW w:type="dxa" w:w="1728"/>
+          </w:tcPr>
+          <w:p>
+            <w:r>
+              <w:t>-8.47</w:t>
+            </w:r>
+          </w:p>
+        </w:tc>
+        <w:tc>
+          <w:tcPr>
+            <w:tcW w:type="dxa" w:w="1728"/>
+          </w:tcPr>
+          <w:p>
+            <w:r>
+              <w:t>311</w:t>
+            </w:r>
+          </w:p>
+        </w:tc>
+        <w:tc>
+          <w:tcPr>
+            <w:tcW w:type="dxa" w:w="1728"/>
+          </w:tcPr>
+          <w:p>
+            <w:r>
+              <w:t>14.6%</w:t>
+            </w:r>
+          </w:p>
+        </w:tc>
+      </w:tr>
+      <w:tr>
+        <w:tc>
+          <w:tcPr>
+            <w:tcW w:type="dxa" w:w="1728"/>
+          </w:tcPr>
+          <w:p>
+            <w:r>
+              <w:t>NEAR</w:t>
+            </w:r>
+          </w:p>
+        </w:tc>
+        <w:tc>
+          <w:tcPr>
+            <w:tcW w:type="dxa" w:w="1728"/>
+          </w:tcPr>
+          <w:p>
+            <w:r>
+              <w:t>-96.12%</w:t>
+            </w:r>
+          </w:p>
+        </w:tc>
+        <w:tc>
+          <w:tcPr>
+            <w:tcW w:type="dxa" w:w="1728"/>
+          </w:tcPr>
+          <w:p>
+            <w:r>
+              <w:t>-6.45</w:t>
+            </w:r>
+          </w:p>
+        </w:tc>
+        <w:tc>
+          <w:tcPr>
+            <w:tcW w:type="dxa" w:w="1728"/>
+          </w:tcPr>
+          <w:p>
+            <w:r>
+              <w:t>568</w:t>
+            </w:r>
+          </w:p>
+        </w:tc>
+        <w:tc>
+          <w:tcPr>
+            <w:tcW w:type="dxa" w:w="1728"/>
+          </w:tcPr>
+          <w:p>
+            <w:r>
+              <w:t>18.3%</w:t>
+            </w:r>
+          </w:p>
+        </w:tc>
+      </w:tr>
+    </w:tbl>
+    <w:p>
+      <w:pPr>
+        <w:pStyle w:val="Heading1"/>
+      </w:pPr>
+      <w:r>
+        <w:rPr>
+          <w:color w:val="003366"/>
+        </w:rPr>
+        <w:t>5. Optuna Walk-Forward (istorical)</w:t>
+      </w:r>
+    </w:p>
+    <w:p>
+      <w:r>
+        <w:t>Ранее полученные результаты Optuna оптимизации:</w:t>
+      </w:r>
+    </w:p>
+    <w:tbl>
+      <w:tblPr>
+        <w:tblStyle w:val="LightGrid-Accent1"/>
+        <w:tblW w:type="auto" w:w="0"/>
+        <w:jc w:val="center"/>
+        <w:tblLook w:firstColumn="1" w:firstRow="1" w:lastColumn="0" w:lastRow="0" w:noHBand="0" w:noVBand="1" w:val="04A0"/>
+      </w:tblPr>
+      <w:tblGrid>
+        <w:gridCol w:w="1728"/>
+        <w:gridCol w:w="1728"/>
+        <w:gridCol w:w="1728"/>
+        <w:gridCol w:w="1728"/>
+        <w:gridCol w:w="1728"/>
+      </w:tblGrid>
+      <w:tr>
+        <w:tc>
+          <w:tcPr>
+            <w:tcW w:type="dxa" w:w="1728"/>
+          </w:tcPr>
+          <w:p>
+            <w:r>
+              <w:rPr>
+                <w:b/>
+              </w:rPr>
+              <w:t>Инструмент</w:t>
+            </w:r>
+          </w:p>
+        </w:tc>
+        <w:tc>
+          <w:tcPr>
+            <w:tcW w:type="dxa" w:w="1728"/>
+          </w:tcPr>
+          <w:p>
+            <w:r>
+              <w:rPr>
+                <w:b/>
+              </w:rPr>
+              <w:t>Return</w:t>
+            </w:r>
+          </w:p>
+        </w:tc>
+        <w:tc>
+          <w:tcPr>
+            <w:tcW w:type="dxa" w:w="1728"/>
+          </w:tcPr>
+          <w:p>
+            <w:r>
+              <w:rPr>
+                <w:b/>
+              </w:rPr>
+              <w:t>Sharpe</w:t>
+            </w:r>
+          </w:p>
+        </w:tc>
+        <w:tc>
+          <w:tcPr>
+            <w:tcW w:type="dxa" w:w="1728"/>
+          </w:tcPr>
+          <w:p>
+            <w:r>
+              <w:rPr>
+                <w:b/>
+              </w:rPr>
+              <w:t>MaxDD</w:t>
+            </w:r>
+          </w:p>
+        </w:tc>
+        <w:tc>
+          <w:tcPr>
+            <w:tcW w:type="dxa" w:w="1728"/>
+          </w:tcPr>
+          <w:p>
+            <w:r>
+              <w:rPr>
+                <w:b/>
+              </w:rPr>
+              <w:t>Win%</w:t>
+            </w:r>
+          </w:p>
+        </w:tc>
+      </w:tr>
+      <w:tr>
+        <w:tc>
+          <w:tcPr>
+            <w:tcW w:type="dxa" w:w="1728"/>
+          </w:tcPr>
+          <w:p>
+            <w:r>
+              <w:t>NEAR</w:t>
+            </w:r>
+          </w:p>
+        </w:tc>
+        <w:tc>
+          <w:tcPr>
+            <w:tcW w:type="dxa" w:w="1728"/>
+          </w:tcPr>
+          <w:p>
+            <w:r>
+              <w:t>+241.78%</w:t>
+            </w:r>
+          </w:p>
+        </w:tc>
+        <w:tc>
+          <w:tcPr>
+            <w:tcW w:type="dxa" w:w="1728"/>
+          </w:tcPr>
+          <w:p>
+            <w:r>
+              <w:t>1.09</w:t>
+            </w:r>
+          </w:p>
+        </w:tc>
+        <w:tc>
+          <w:tcPr>
+            <w:tcW w:type="dxa" w:w="1728"/>
+          </w:tcPr>
+          <w:p>
+            <w:r>
+              <w:t>-45.28%</w:t>
+            </w:r>
+          </w:p>
+        </w:tc>
+        <w:tc>
+          <w:tcPr>
+            <w:tcW w:type="dxa" w:w="1728"/>
+          </w:tcPr>
+          <w:p>
+            <w:r>
+              <w:t>35.6%</w:t>
+            </w:r>
+          </w:p>
+        </w:tc>
+      </w:tr>
+      <w:tr>
+        <w:tc>
+          <w:tcPr>
+            <w:tcW w:type="dxa" w:w="1728"/>
+          </w:tcPr>
+          <w:p>
+            <w:r>
+              <w:t>SOL</w:t>
+            </w:r>
+          </w:p>
+        </w:tc>
+        <w:tc>
+          <w:tcPr>
+            <w:tcW w:type="dxa" w:w="1728"/>
+          </w:tcPr>
+          <w:p>
+            <w:r>
+              <w:t>+48.37%</w:t>
+            </w:r>
+          </w:p>
+        </w:tc>
+        <w:tc>
+          <w:tcPr>
+            <w:tcW w:type="dxa" w:w="1728"/>
+          </w:tcPr>
+          <w:p>
+            <w:r>
+              <w:t>0.46</w:t>
+            </w:r>
+          </w:p>
+        </w:tc>
+        <w:tc>
+          <w:tcPr>
+            <w:tcW w:type="dxa" w:w="1728"/>
+          </w:tcPr>
+          <w:p>
+            <w:r>
+              <w:t>-32.55%</w:t>
+            </w:r>
+          </w:p>
+        </w:tc>
+        <w:tc>
+          <w:tcPr>
+            <w:tcW w:type="dxa" w:w="1728"/>
+          </w:tcPr>
+          <w:p>
+            <w:r>
+              <w:t>37.0%</w:t>
+            </w:r>
+          </w:p>
+        </w:tc>
+      </w:tr>
+    </w:tbl>
+    <w:p>
+      <w:pPr>
+        <w:pStyle w:val="Heading1"/>
+      </w:pPr>
+      <w:r>
+        <w:rPr>
+          <w:color w:val="003366"/>
+        </w:rPr>
+        <w:t>6. Сравнение таймфреймов</w:t>
+      </w:r>
+    </w:p>
+    <w:tbl>
+      <w:tblPr>
+        <w:tblStyle w:val="LightGrid-Accent1"/>
+        <w:tblW w:type="auto" w:w="0"/>
+        <w:jc w:val="center"/>
+        <w:tblLook w:firstColumn="1" w:firstRow="1" w:lastColumn="0" w:lastRow="0" w:noHBand="0" w:noVBand="1" w:val="04A0"/>
+      </w:tblPr>
+      <w:tblGrid>
+        <w:gridCol w:w="1728"/>
+        <w:gridCol w:w="1728"/>
+        <w:gridCol w:w="1728"/>
+        <w:gridCol w:w="1728"/>
+        <w:gridCol w:w="1728"/>
+      </w:tblGrid>
+      <w:tr>
+        <w:tc>
+          <w:tcPr>
+            <w:tcW w:type="dxa" w:w="1728"/>
+          </w:tcPr>
+          <w:p>
+            <w:r>
+              <w:rPr>
+                <w:b/>
+              </w:rPr>
+              <w:t>Таймфрейм</w:t>
+            </w:r>
+          </w:p>
+        </w:tc>
+        <w:tc>
+          <w:tcPr>
+            <w:tcW w:type="dxa" w:w="1728"/>
+          </w:tcPr>
+          <w:p>
+            <w:r>
+              <w:rPr>
+                <w:b/>
+              </w:rPr>
+              <w:t>Прибыльных</w:t>
+            </w:r>
+          </w:p>
+        </w:tc>
+        <w:tc>
+          <w:tcPr>
+            <w:tcW w:type="dxa" w:w="1728"/>
+          </w:tcPr>
+          <w:p>
+            <w:r>
+              <w:rPr>
+                <w:b/>
+              </w:rPr>
+              <w:t>Лучший</w:t>
+            </w:r>
+          </w:p>
+        </w:tc>
+        <w:tc>
+          <w:tcPr>
+            <w:tcW w:type="dxa" w:w="1728"/>
+          </w:tcPr>
+          <w:p>
+            <w:r>
+              <w:rPr>
+                <w:b/>
+              </w:rPr>
+              <w:t>Лучший Return</w:t>
+            </w:r>
+          </w:p>
+        </w:tc>
+        <w:tc>
+          <w:tcPr>
+            <w:tcW w:type="dxa" w:w="1728"/>
+          </w:tcPr>
+          <w:p>
+            <w:r>
+              <w:rPr>
+                <w:b/>
+              </w:rPr>
+              <w:t>Средний Return</w:t>
+            </w:r>
+          </w:p>
+        </w:tc>
+      </w:tr>
+      <w:tr>
+        <w:tc>
+          <w:tcPr>
+            <w:tcW w:type="dxa" w:w="1728"/>
+          </w:tcPr>
+          <w:p>
+            <w:r>
+              <w:t>1день</w:t>
+            </w:r>
+          </w:p>
+        </w:tc>
+        <w:tc>
+          <w:tcPr>
+            <w:tcW w:type="dxa" w:w="1728"/>
+          </w:tcPr>
+          <w:p>
+            <w:r>
+              <w:t>9/11 (82%)</w:t>
+            </w:r>
+          </w:p>
+        </w:tc>
+        <w:tc>
+          <w:tcPr>
+            <w:tcW w:type="dxa" w:w="1728"/>
+          </w:tcPr>
+          <w:p>
+            <w:r>
+              <w:t>SOL</w:t>
+            </w:r>
+          </w:p>
+        </w:tc>
+        <w:tc>
+          <w:tcPr>
+            <w:tcW w:type="dxa" w:w="1728"/>
+          </w:tcPr>
+          <w:p>
+            <w:r>
+              <w:t>+87.44%</w:t>
+            </w:r>
+          </w:p>
+        </w:tc>
+        <w:tc>
+          <w:tcPr>
+            <w:tcW w:type="dxa" w:w="1728"/>
+          </w:tcPr>
+          <w:p>
+            <w:r>
+              <w:t>+49.7%</w:t>
+            </w:r>
+          </w:p>
+        </w:tc>
+      </w:tr>
+      <w:tr>
+        <w:tc>
+          <w:tcPr>
+            <w:tcW w:type="dxa" w:w="1728"/>
+          </w:tcPr>
+          <w:p>
+            <w:r>
+              <w:t>15мин</w:t>
+            </w:r>
+          </w:p>
+        </w:tc>
+        <w:tc>
+          <w:tcPr>
+            <w:tcW w:type="dxa" w:w="1728"/>
+          </w:tcPr>
+          <w:p>
+            <w:r>
+              <w:t>0/12 (0%)</w:t>
+            </w:r>
+          </w:p>
+        </w:tc>
+        <w:tc>
+          <w:tcPr>
+            <w:tcW w:type="dxa" w:w="1728"/>
+          </w:tcPr>
+          <w:p>
+            <w:r>
+              <w:t>TRX</w:t>
+            </w:r>
+          </w:p>
+        </w:tc>
+        <w:tc>
+          <w:tcPr>
+            <w:tcW w:type="dxa" w:w="1728"/>
+          </w:tcPr>
+          <w:p>
+            <w:r>
+              <w:t>-21.62%</w:t>
+            </w:r>
+          </w:p>
+        </w:tc>
+        <w:tc>
+          <w:tcPr>
+            <w:tcW w:type="dxa" w:w="1728"/>
+          </w:tcPr>
+          <w:p>
+            <w:r>
+              <w:t>-65.8%</w:t>
+            </w:r>
+          </w:p>
+        </w:tc>
+      </w:tr>
+      <w:tr>
+        <w:tc>
+          <w:tcPr>
+            <w:tcW w:type="dxa" w:w="1728"/>
+          </w:tcPr>
+          <w:p>
+            <w:r>
+              <w:t>1мин</w:t>
+            </w:r>
+          </w:p>
+        </w:tc>
+        <w:tc>
+          <w:tcPr>
+            <w:tcW w:type="dxa" w:w="1728"/>
+          </w:tcPr>
+          <w:p>
+            <w:r>
+              <w:t>0/12 (0%)</w:t>
+            </w:r>
+          </w:p>
+        </w:tc>
+        <w:tc>
+          <w:tcPr>
+            <w:tcW w:type="dxa" w:w="1728"/>
+          </w:tcPr>
+          <w:p>
+            <w:r>
+              <w:t>XLM</w:t>
+            </w:r>
+          </w:p>
+        </w:tc>
+        <w:tc>
+          <w:tcPr>
+            <w:tcW w:type="dxa" w:w="1728"/>
+          </w:tcPr>
+          <w:p>
+            <w:r>
+              <w:t>-0.48%</w:t>
+            </w:r>
+          </w:p>
+        </w:tc>
+        <w:tc>
+          <w:tcPr>
+            <w:tcW w:type="dxa" w:w="1728"/>
+          </w:tcPr>
+          <w:p>
+            <w:r>
+              <w:t>-2.1%</w:t>
+            </w:r>
+          </w:p>
+        </w:tc>
+      </w:tr>
+    </w:tbl>
+    <w:p>
+      <w:pPr>
+        <w:pStyle w:val="Heading1"/>
+      </w:pPr>
+      <w:r>
+        <w:rPr>
+          <w:color w:val="003366"/>
+        </w:rPr>
+        <w:t>7. Рекомендации</w:t>
+      </w:r>
+    </w:p>
+    <w:p>
+      <w:r>
+        <w:t>1. **Основная стратегия**: Использовать 1день таймфрейм</w:t>
+        <w:br/>
+        <w:t>2. **Лучшие инструменты**: SOL, NEAR, AAVE, SUI, LINK</w:t>
+        <w:br/>
+        <w:t>3. **Исключить**: Bitcoin, TRX (убыточны на всех ТФ)</w:t>
+        <w:br/>
+        <w:t>4. **15мин/1мин**: Требуется доработка модели</w:t>
+        <w:br/>
+        <w:t xml:space="preserve">   - Использовать GPU для обучения</w:t>
+        <w:br/>
+        <w:t xml:space="preserve">   - Увеличить эпохи до 100-200</w:t>
+        <w:br/>
+        <w:t xml:space="preserve">   - Добавить order flow фичи</w:t>
+        <w:br/>
+        <w:t xml:space="preserve">   - Рассмотреть PPO/SAC вместо DQN</w:t>
+        <w:br/>
+        <w:t>5. **Манименеджмент**: SL 3%, TP 7%, trailing stop 1%</w:t>
+        <w:br/>
+        <w:t>6. **Комиссии**: 0.1% taker + 0.05% slippage + 0.05% spread</w:t>
+      </w:r>
+    </w:p>
+    <w:p>
+      <w:pPr>
+        <w:pStyle w:val="Heading1"/>
+      </w:pPr>
+      <w:r>
+        <w:rPr>
+          <w:color w:val="003366"/>
+        </w:rPr>
+        <w:t>8. Технические детали</w:t>
+      </w:r>
+    </w:p>
+    <w:p>
+      <w:r>
+        <w:t>- Python 3.13, PyTorch 2.x, scikit-learn, XGBoost, CatBoost, LightGBM</w:t>
+        <w:br/>
+        <w:t>- DQN RL: Dueling DQN + Double DQN, Replay Buffer 10000</w:t>
+        <w:br/>
+        <w:t>- Walk-forward: anchored expanding window, embargo=3-7</w:t>
+        <w:br/>
+        <w:t>- Feature selection: Random Forest + Mutual Information</w:t>
+        <w:br/>
+        <w:t>- Auto-select топ-8-30 фичей из 94+</w:t>
+        <w:br/>
+        <w:t>- Gradient clipping: max_grad_norm=1.0</w:t>
+        <w:br/>
+        <w:t>- Early stopping: patience=3-5</w:t>
+      </w:r>
+    </w:p>
+    <w:p>
+      <w:pPr>
+        <w:pStyle w:val="Heading1"/>
+      </w:pPr>
+      <w:r>
+        <w:rPr>
+          <w:color w:val="003366"/>
+        </w:rPr>
+        <w:t>9. Структура файлов</w:t>
+      </w:r>
+    </w:p>
+    <w:p>
+      <w:r>
+        <w:t>nn-trading/</w:t>
+        <w:br/>
+        <w:t>├── data/                          # CSV данные</w:t>
+        <w:br/>
+        <w:t>│   ├── binance_*_1min.csv        # 1мин данные (30 дней)</w:t>
+        <w:br/>
+        <w:t>│   ├── *_15m.csv                 # 15мин данные</w:t>
+        <w:br/>
+        <w:t>│   └── binance_*_1d.csv          # дневные данные</w:t>
+        <w:br/>
+        <w:t>├── results/                       # Результаты</w:t>
+        <w:br/>
+        <w:t>│   ├── optimized_model_results.json</w:t>
+        <w:br/>
+        <w:t>│   ├── optimized_tf_test.json</w:t>
+        <w:br/>
+        <w:t>│   ├── rl_ultra_results.json</w:t>
+        <w:br/>
+        <w:t>│   └── rl_fast_results.json</w:t>
+        <w:br/>
+        <w:t>├── model.py                       # LSTM/TCN/Transformer/Attention</w:t>
+        <w:br/>
+        <w:t>├── rl_agent.py                    # DQN RL агент</w:t>
+        <w:br/>
+        <w:t>├── train.py                       # Обучение моделей</w:t>
+        <w:br/>
+        <w:t>├── features.py                    # 160+ TA-Lib индикаторов</w:t>
+        <w:br/>
+        <w:t>├── walk_forward.py                # Walk-forward валидация</w:t>
+        <w:br/>
+        <w:t>├── test_optimized_v2.py           # Оптимизированный тест</w:t>
+        <w:br/>
+        <w:t>├── train_rl_ultra.py              # RL обучение</w:t>
+        <w:br/>
+        <w:t>├── config.py                      # Конфигурация</w:t>
+        <w:br/>
+        <w:t>└── requirements.txt               # Зависимости</w:t>
+      </w:r>
+    </w:p>
     <w:sectPr>
       <w:pgSz w:w="12240" w:h="15840"/>
       <w:pgMar w:top="1440" w:right="1800" w:bottom="1440" w:left="1800" w:header="720" w:footer="720" w:gutter="0"/>

</xml_diff>